<commit_message>
Teste finalizar pedido inserido
</commit_message>
<xml_diff>
--- a/docs/Plano e Estratégia de Testes - Ped.docx
+++ b/docs/Plano e Estratégia de Testes - Ped.docx
@@ -486,14 +486,7 @@
           <w:b/>
           <w:bCs/>
         </w:rPr>
-        <w:t>T</w:t>
-      </w:r>
-      <w:r>
-        <w:rPr>
-          <w:b/>
-          <w:bCs/>
-        </w:rPr>
-        <w:t>estar login com dados válidos e inválidos</w:t>
+        <w:t>Testar login com dados válidos e inválidos</w:t>
       </w:r>
     </w:p>
     <w:p/>
@@ -574,6 +567,9 @@
             <w:r>
               <w:t>1</w:t>
             </w:r>
+            <w:r>
+              <w:t>.1</w:t>
+            </w:r>
           </w:p>
         </w:tc>
         <w:tc>
@@ -616,7 +612,13 @@
               <w:cnfStyle w:val="000000000000" w:firstRow="0" w:lastRow="0" w:firstColumn="0" w:lastColumn="0" w:oddVBand="0" w:evenVBand="0" w:oddHBand="0" w:evenHBand="0" w:firstRowFirstColumn="0" w:firstRowLastColumn="0" w:lastRowFirstColumn="0" w:lastRowLastColumn="0"/>
             </w:pPr>
             <w:r>
-              <w:t>api</w:t>
+              <w:t>A</w:t>
+            </w:r>
+            <w:r>
+              <w:t>pi</w:t>
+            </w:r>
+            <w:r>
+              <w:t>, web</w:t>
             </w:r>
           </w:p>
         </w:tc>
@@ -668,7 +670,7 @@
               <w:cnfStyle w:val="000000000000" w:firstRow="0" w:lastRow="0" w:firstColumn="0" w:lastColumn="0" w:oddVBand="0" w:evenVBand="0" w:oddHBand="0" w:evenHBand="0" w:firstRowFirstColumn="0" w:firstRowLastColumn="0" w:lastRowFirstColumn="0" w:lastRowLastColumn="0"/>
             </w:pPr>
             <w:r>
-              <w:t>api</w:t>
+              <w:t>Api, web</w:t>
             </w:r>
           </w:p>
         </w:tc>
@@ -720,7 +722,7 @@
               <w:cnfStyle w:val="000000000000" w:firstRow="0" w:lastRow="0" w:firstColumn="0" w:lastColumn="0" w:oddVBand="0" w:evenVBand="0" w:oddHBand="0" w:evenHBand="0" w:firstRowFirstColumn="0" w:firstRowLastColumn="0" w:lastRowFirstColumn="0" w:lastRowLastColumn="0"/>
             </w:pPr>
             <w:r>
-              <w:t>api</w:t>
+              <w:t>Api, web</w:t>
             </w:r>
           </w:p>
         </w:tc>
@@ -772,7 +774,7 @@
               <w:cnfStyle w:val="000000000000" w:firstRow="0" w:lastRow="0" w:firstColumn="0" w:lastColumn="0" w:oddVBand="0" w:evenVBand="0" w:oddHBand="0" w:evenHBand="0" w:firstRowFirstColumn="0" w:firstRowLastColumn="0" w:lastRowFirstColumn="0" w:lastRowLastColumn="0"/>
             </w:pPr>
             <w:r>
-              <w:t>api</w:t>
+              <w:t>Api, web</w:t>
             </w:r>
           </w:p>
         </w:tc>
@@ -824,7 +826,7 @@
               <w:cnfStyle w:val="000000000000" w:firstRow="0" w:lastRow="0" w:firstColumn="0" w:lastColumn="0" w:oddVBand="0" w:evenVBand="0" w:oddHBand="0" w:evenHBand="0" w:firstRowFirstColumn="0" w:firstRowLastColumn="0" w:lastRowFirstColumn="0" w:lastRowLastColumn="0"/>
             </w:pPr>
             <w:r>
-              <w:t>api</w:t>
+              <w:t>Api, web</w:t>
             </w:r>
           </w:p>
         </w:tc>
@@ -850,15 +852,7 @@
               <w:cnfStyle w:val="000000000000" w:firstRow="0" w:lastRow="0" w:firstColumn="0" w:lastColumn="0" w:oddVBand="0" w:evenVBand="0" w:oddHBand="0" w:evenHBand="0" w:firstRowFirstColumn="0" w:firstRowLastColumn="0" w:lastRowFirstColumn="0" w:lastRowLastColumn="0"/>
             </w:pPr>
             <w:r>
-              <w:t xml:space="preserve">Testar com usuário </w:t>
-            </w:r>
-            <w:proofErr w:type="gramStart"/>
-            <w:r>
-              <w:t>válido</w:t>
-            </w:r>
-            <w:proofErr w:type="gramEnd"/>
-            <w:r>
-              <w:t xml:space="preserve"> mas senha inválida</w:t>
+              <w:t>Testar com usuário válido mas com senha inválida</w:t>
             </w:r>
           </w:p>
         </w:tc>
@@ -884,7 +878,7 @@
               <w:cnfStyle w:val="000000000000" w:firstRow="0" w:lastRow="0" w:firstColumn="0" w:lastColumn="0" w:oddVBand="0" w:evenVBand="0" w:oddHBand="0" w:evenHBand="0" w:firstRowFirstColumn="0" w:firstRowLastColumn="0" w:lastRowFirstColumn="0" w:lastRowLastColumn="0"/>
             </w:pPr>
             <w:r>
-              <w:t>api</w:t>
+              <w:t>Api, web</w:t>
             </w:r>
           </w:p>
         </w:tc>
@@ -898,12 +892,44 @@
           <w:bCs/>
         </w:rPr>
       </w:pPr>
-      <w:r>
-        <w:rPr>
-          <w:b/>
-          <w:bCs/>
-        </w:rPr>
+    </w:p>
+    <w:p>
+      <w:pPr>
+        <w:rPr>
+          <w:b/>
+          <w:bCs/>
+        </w:rPr>
+      </w:pPr>
+    </w:p>
+    <w:p>
+      <w:pPr>
+        <w:rPr>
+          <w:b/>
+          <w:bCs/>
+        </w:rPr>
+      </w:pPr>
+    </w:p>
+    <w:p>
+      <w:pPr>
+        <w:rPr>
+          <w:b/>
+          <w:bCs/>
+        </w:rPr>
+      </w:pPr>
+      <w:r>
+        <w:rPr>
+          <w:b/>
+          <w:bCs/>
+        </w:rPr>
+        <w:lastRenderedPageBreak/>
         <w:t>2: Registrar usuários</w:t>
+      </w:r>
+      <w:r>
+        <w:rPr>
+          <w:b/>
+          <w:bCs/>
+        </w:rPr>
+        <w:t xml:space="preserve"> com dados válidos e inválidos</w:t>
       </w:r>
     </w:p>
     <w:p/>
@@ -982,9 +1008,11 @@
           </w:tcPr>
           <w:p>
             <w:r>
-              <w:lastRenderedPageBreak/>
               <w:t>2</w:t>
             </w:r>
+            <w:r>
+              <w:t>.1</w:t>
+            </w:r>
           </w:p>
         </w:tc>
         <w:tc>
@@ -998,6 +1026,9 @@
             <w:r>
               <w:t>Registrar usuários</w:t>
             </w:r>
+            <w:r>
+              <w:t xml:space="preserve"> com dados válidos</w:t>
+            </w:r>
           </w:p>
         </w:tc>
         <w:tc>
@@ -1010,6 +1041,119 @@
             </w:pPr>
             <w:r>
               <w:t>Registre o usuário</w:t>
+            </w:r>
+          </w:p>
+        </w:tc>
+        <w:tc>
+          <w:tcPr>
+            <w:tcW w:w="2221" w:type="dxa"/>
+          </w:tcPr>
+          <w:p>
+            <w:pPr>
+              <w:cnfStyle w:val="000000000000" w:firstRow="0" w:lastRow="0" w:firstColumn="0" w:lastColumn="0" w:oddVBand="0" w:evenVBand="0" w:oddHBand="0" w:evenHBand="0" w:firstRowFirstColumn="0" w:firstRowLastColumn="0" w:lastRowFirstColumn="0" w:lastRowLastColumn="0"/>
+            </w:pPr>
+            <w:r>
+              <w:t>api</w:t>
+            </w:r>
+          </w:p>
+        </w:tc>
+      </w:tr>
+      <w:tr>
+        <w:tc>
+          <w:tcPr>
+            <w:cnfStyle w:val="001000000000" w:firstRow="0" w:lastRow="0" w:firstColumn="1" w:lastColumn="0" w:oddVBand="0" w:evenVBand="0" w:oddHBand="0" w:evenHBand="0" w:firstRowFirstColumn="0" w:firstRowLastColumn="0" w:lastRowFirstColumn="0" w:lastRowLastColumn="0"/>
+            <w:tcW w:w="895" w:type="dxa"/>
+          </w:tcPr>
+          <w:p>
+            <w:r>
+              <w:t>2.2</w:t>
+            </w:r>
+          </w:p>
+        </w:tc>
+        <w:tc>
+          <w:tcPr>
+            <w:tcW w:w="3796" w:type="dxa"/>
+          </w:tcPr>
+          <w:p>
+            <w:pPr>
+              <w:cnfStyle w:val="000000000000" w:firstRow="0" w:lastRow="0" w:firstColumn="0" w:lastColumn="0" w:oddVBand="0" w:evenVBand="0" w:oddHBand="0" w:evenHBand="0" w:firstRowFirstColumn="0" w:firstRowLastColumn="0" w:lastRowFirstColumn="0" w:lastRowLastColumn="0"/>
+            </w:pPr>
+            <w:r>
+              <w:t xml:space="preserve">Registrar usuários com dados </w:t>
+            </w:r>
+            <w:r>
+              <w:t>repetidos</w:t>
+            </w:r>
+          </w:p>
+        </w:tc>
+        <w:tc>
+          <w:tcPr>
+            <w:tcW w:w="2438" w:type="dxa"/>
+          </w:tcPr>
+          <w:p>
+            <w:pPr>
+              <w:cnfStyle w:val="000000000000" w:firstRow="0" w:lastRow="0" w:firstColumn="0" w:lastColumn="0" w:oddVBand="0" w:evenVBand="0" w:oddHBand="0" w:evenHBand="0" w:firstRowFirstColumn="0" w:firstRowLastColumn="0" w:lastRowFirstColumn="0" w:lastRowLastColumn="0"/>
+            </w:pPr>
+            <w:r>
+              <w:t>Erro</w:t>
+            </w:r>
+          </w:p>
+        </w:tc>
+        <w:tc>
+          <w:tcPr>
+            <w:tcW w:w="2221" w:type="dxa"/>
+          </w:tcPr>
+          <w:p>
+            <w:pPr>
+              <w:cnfStyle w:val="000000000000" w:firstRow="0" w:lastRow="0" w:firstColumn="0" w:lastColumn="0" w:oddVBand="0" w:evenVBand="0" w:oddHBand="0" w:evenHBand="0" w:firstRowFirstColumn="0" w:firstRowLastColumn="0" w:lastRowFirstColumn="0" w:lastRowLastColumn="0"/>
+            </w:pPr>
+            <w:r>
+              <w:t>api</w:t>
+            </w:r>
+          </w:p>
+        </w:tc>
+      </w:tr>
+      <w:tr>
+        <w:tc>
+          <w:tcPr>
+            <w:cnfStyle w:val="001000000000" w:firstRow="0" w:lastRow="0" w:firstColumn="1" w:lastColumn="0" w:oddVBand="0" w:evenVBand="0" w:oddHBand="0" w:evenHBand="0" w:firstRowFirstColumn="0" w:firstRowLastColumn="0" w:lastRowFirstColumn="0" w:lastRowLastColumn="0"/>
+            <w:tcW w:w="895" w:type="dxa"/>
+          </w:tcPr>
+          <w:p>
+            <w:r>
+              <w:t>2.3</w:t>
+            </w:r>
+          </w:p>
+        </w:tc>
+        <w:tc>
+          <w:tcPr>
+            <w:tcW w:w="3796" w:type="dxa"/>
+          </w:tcPr>
+          <w:p>
+            <w:pPr>
+              <w:cnfStyle w:val="000000000000" w:firstRow="0" w:lastRow="0" w:firstColumn="0" w:lastColumn="0" w:oddVBand="0" w:evenVBand="0" w:oddHBand="0" w:evenHBand="0" w:firstRowFirstColumn="0" w:firstRowLastColumn="0" w:lastRowFirstColumn="0" w:lastRowLastColumn="0"/>
+            </w:pPr>
+            <w:r>
+              <w:t>Preencher</w:t>
+            </w:r>
+            <w:r>
+              <w:t xml:space="preserve"> usuário faltando preencher</w:t>
+            </w:r>
+            <w:r>
+              <w:t xml:space="preserve"> um dos dados como nome, tipo e senha</w:t>
+            </w:r>
+          </w:p>
+        </w:tc>
+        <w:tc>
+          <w:tcPr>
+            <w:tcW w:w="2438" w:type="dxa"/>
+          </w:tcPr>
+          <w:p>
+            <w:pPr>
+              <w:cnfStyle w:val="000000000000" w:firstRow="0" w:lastRow="0" w:firstColumn="0" w:lastColumn="0" w:oddVBand="0" w:evenVBand="0" w:oddHBand="0" w:evenHBand="0" w:firstRowFirstColumn="0" w:firstRowLastColumn="0" w:lastRowFirstColumn="0" w:lastRowLastColumn="0"/>
+            </w:pPr>
+            <w:r>
+              <w:t>Erro</w:t>
             </w:r>
           </w:p>
         </w:tc>
@@ -1052,6 +1196,13 @@
           <w:bCs/>
         </w:rPr>
         <w:t>3: Consultar pedido</w:t>
+      </w:r>
+      <w:r>
+        <w:rPr>
+          <w:b/>
+          <w:bCs/>
+        </w:rPr>
+        <w:t xml:space="preserve"> com dados válidos e inválidos</w:t>
       </w:r>
     </w:p>
     <w:p/>
@@ -1132,6 +1283,9 @@
             <w:r>
               <w:t>3</w:t>
             </w:r>
+            <w:r>
+              <w:t>.1</w:t>
+            </w:r>
           </w:p>
         </w:tc>
         <w:tc>
@@ -1143,7 +1297,7 @@
               <w:cnfStyle w:val="000000000000" w:firstRow="0" w:lastRow="0" w:firstColumn="0" w:lastColumn="0" w:oddVBand="0" w:evenVBand="0" w:oddHBand="0" w:evenHBand="0" w:firstRowFirstColumn="0" w:firstRowLastColumn="0" w:lastRowFirstColumn="0" w:lastRowLastColumn="0"/>
             </w:pPr>
             <w:r>
-              <w:t>Finalizar pedido</w:t>
+              <w:t>Consultar pedido com nome e senha válidos</w:t>
             </w:r>
           </w:p>
         </w:tc>
@@ -1155,8 +1309,175 @@
             <w:pPr>
               <w:cnfStyle w:val="000000000000" w:firstRow="0" w:lastRow="0" w:firstColumn="0" w:lastColumn="0" w:oddVBand="0" w:evenVBand="0" w:oddHBand="0" w:evenHBand="0" w:firstRowFirstColumn="0" w:firstRowLastColumn="0" w:lastRowFirstColumn="0" w:lastRowLastColumn="0"/>
             </w:pPr>
-            <w:r>
-              <w:t>Finalize o pedido</w:t>
+            <w:proofErr w:type="spellStart"/>
+            <w:r>
+              <w:t>Pass</w:t>
+            </w:r>
+            <w:proofErr w:type="spellEnd"/>
+          </w:p>
+        </w:tc>
+        <w:tc>
+          <w:tcPr>
+            <w:tcW w:w="2221" w:type="dxa"/>
+          </w:tcPr>
+          <w:p>
+            <w:pPr>
+              <w:cnfStyle w:val="000000000000" w:firstRow="0" w:lastRow="0" w:firstColumn="0" w:lastColumn="0" w:oddVBand="0" w:evenVBand="0" w:oddHBand="0" w:evenHBand="0" w:firstRowFirstColumn="0" w:firstRowLastColumn="0" w:lastRowFirstColumn="0" w:lastRowLastColumn="0"/>
+            </w:pPr>
+            <w:r>
+              <w:t>api</w:t>
+            </w:r>
+          </w:p>
+        </w:tc>
+      </w:tr>
+      <w:tr>
+        <w:tc>
+          <w:tcPr>
+            <w:cnfStyle w:val="001000000000" w:firstRow="0" w:lastRow="0" w:firstColumn="1" w:lastColumn="0" w:oddVBand="0" w:evenVBand="0" w:oddHBand="0" w:evenHBand="0" w:firstRowFirstColumn="0" w:firstRowLastColumn="0" w:lastRowFirstColumn="0" w:lastRowLastColumn="0"/>
+            <w:tcW w:w="895" w:type="dxa"/>
+          </w:tcPr>
+          <w:p>
+            <w:r>
+              <w:t>3.2</w:t>
+            </w:r>
+          </w:p>
+        </w:tc>
+        <w:tc>
+          <w:tcPr>
+            <w:tcW w:w="3796" w:type="dxa"/>
+          </w:tcPr>
+          <w:p>
+            <w:pPr>
+              <w:cnfStyle w:val="000000000000" w:firstRow="0" w:lastRow="0" w:firstColumn="0" w:lastColumn="0" w:oddVBand="0" w:evenVBand="0" w:oddHBand="0" w:evenHBand="0" w:firstRowFirstColumn="0" w:firstRowLastColumn="0" w:lastRowFirstColumn="0" w:lastRowLastColumn="0"/>
+            </w:pPr>
+            <w:r>
+              <w:t xml:space="preserve">Consultar pedido com nome e senha </w:t>
+            </w:r>
+            <w:r>
+              <w:t>inválidos</w:t>
+            </w:r>
+          </w:p>
+        </w:tc>
+        <w:tc>
+          <w:tcPr>
+            <w:tcW w:w="2438" w:type="dxa"/>
+          </w:tcPr>
+          <w:p>
+            <w:pPr>
+              <w:cnfStyle w:val="000000000000" w:firstRow="0" w:lastRow="0" w:firstColumn="0" w:lastColumn="0" w:oddVBand="0" w:evenVBand="0" w:oddHBand="0" w:evenHBand="0" w:firstRowFirstColumn="0" w:firstRowLastColumn="0" w:lastRowFirstColumn="0" w:lastRowLastColumn="0"/>
+            </w:pPr>
+            <w:r>
+              <w:t>Erro</w:t>
+            </w:r>
+          </w:p>
+        </w:tc>
+        <w:tc>
+          <w:tcPr>
+            <w:tcW w:w="2221" w:type="dxa"/>
+          </w:tcPr>
+          <w:p>
+            <w:pPr>
+              <w:cnfStyle w:val="000000000000" w:firstRow="0" w:lastRow="0" w:firstColumn="0" w:lastColumn="0" w:oddVBand="0" w:evenVBand="0" w:oddHBand="0" w:evenHBand="0" w:firstRowFirstColumn="0" w:firstRowLastColumn="0" w:lastRowFirstColumn="0" w:lastRowLastColumn="0"/>
+            </w:pPr>
+            <w:r>
+              <w:t>api</w:t>
+            </w:r>
+          </w:p>
+        </w:tc>
+      </w:tr>
+      <w:tr>
+        <w:tc>
+          <w:tcPr>
+            <w:cnfStyle w:val="001000000000" w:firstRow="0" w:lastRow="0" w:firstColumn="1" w:lastColumn="0" w:oddVBand="0" w:evenVBand="0" w:oddHBand="0" w:evenHBand="0" w:firstRowFirstColumn="0" w:firstRowLastColumn="0" w:lastRowFirstColumn="0" w:lastRowLastColumn="0"/>
+            <w:tcW w:w="895" w:type="dxa"/>
+          </w:tcPr>
+          <w:p>
+            <w:r>
+              <w:t>3.3</w:t>
+            </w:r>
+          </w:p>
+        </w:tc>
+        <w:tc>
+          <w:tcPr>
+            <w:tcW w:w="3796" w:type="dxa"/>
+          </w:tcPr>
+          <w:p>
+            <w:pPr>
+              <w:cnfStyle w:val="000000000000" w:firstRow="0" w:lastRow="0" w:firstColumn="0" w:lastColumn="0" w:oddVBand="0" w:evenVBand="0" w:oddHBand="0" w:evenHBand="0" w:firstRowFirstColumn="0" w:firstRowLastColumn="0" w:lastRowFirstColumn="0" w:lastRowLastColumn="0"/>
+            </w:pPr>
+            <w:r>
+              <w:t>Consultar pedid</w:t>
+            </w:r>
+            <w:r>
+              <w:t>o apenas com nome</w:t>
+            </w:r>
+          </w:p>
+        </w:tc>
+        <w:tc>
+          <w:tcPr>
+            <w:tcW w:w="2438" w:type="dxa"/>
+          </w:tcPr>
+          <w:p>
+            <w:pPr>
+              <w:cnfStyle w:val="000000000000" w:firstRow="0" w:lastRow="0" w:firstColumn="0" w:lastColumn="0" w:oddVBand="0" w:evenVBand="0" w:oddHBand="0" w:evenHBand="0" w:firstRowFirstColumn="0" w:firstRowLastColumn="0" w:lastRowFirstColumn="0" w:lastRowLastColumn="0"/>
+            </w:pPr>
+            <w:r>
+              <w:t>Erro</w:t>
+            </w:r>
+          </w:p>
+        </w:tc>
+        <w:tc>
+          <w:tcPr>
+            <w:tcW w:w="2221" w:type="dxa"/>
+          </w:tcPr>
+          <w:p>
+            <w:pPr>
+              <w:cnfStyle w:val="000000000000" w:firstRow="0" w:lastRow="0" w:firstColumn="0" w:lastColumn="0" w:oddVBand="0" w:evenVBand="0" w:oddHBand="0" w:evenHBand="0" w:firstRowFirstColumn="0" w:firstRowLastColumn="0" w:lastRowFirstColumn="0" w:lastRowLastColumn="0"/>
+            </w:pPr>
+            <w:r>
+              <w:t>api</w:t>
+            </w:r>
+          </w:p>
+        </w:tc>
+      </w:tr>
+      <w:tr>
+        <w:tc>
+          <w:tcPr>
+            <w:cnfStyle w:val="001000000000" w:firstRow="0" w:lastRow="0" w:firstColumn="1" w:lastColumn="0" w:oddVBand="0" w:evenVBand="0" w:oddHBand="0" w:evenHBand="0" w:firstRowFirstColumn="0" w:firstRowLastColumn="0" w:lastRowFirstColumn="0" w:lastRowLastColumn="0"/>
+            <w:tcW w:w="895" w:type="dxa"/>
+          </w:tcPr>
+          <w:p>
+            <w:r>
+              <w:t>3.4</w:t>
+            </w:r>
+          </w:p>
+        </w:tc>
+        <w:tc>
+          <w:tcPr>
+            <w:tcW w:w="3796" w:type="dxa"/>
+          </w:tcPr>
+          <w:p>
+            <w:pPr>
+              <w:cnfStyle w:val="000000000000" w:firstRow="0" w:lastRow="0" w:firstColumn="0" w:lastColumn="0" w:oddVBand="0" w:evenVBand="0" w:oddHBand="0" w:evenHBand="0" w:firstRowFirstColumn="0" w:firstRowLastColumn="0" w:lastRowFirstColumn="0" w:lastRowLastColumn="0"/>
+            </w:pPr>
+            <w:r>
+              <w:t xml:space="preserve">Consultar pedido apenas com </w:t>
+            </w:r>
+            <w:r>
+              <w:t>SENHA</w:t>
+            </w:r>
+          </w:p>
+        </w:tc>
+        <w:tc>
+          <w:tcPr>
+            <w:tcW w:w="2438" w:type="dxa"/>
+          </w:tcPr>
+          <w:p>
+            <w:pPr>
+              <w:cnfStyle w:val="000000000000" w:firstRow="0" w:lastRow="0" w:firstColumn="0" w:lastColumn="0" w:oddVBand="0" w:evenVBand="0" w:oddHBand="0" w:evenHBand="0" w:firstRowFirstColumn="0" w:firstRowLastColumn="0" w:lastRowFirstColumn="0" w:lastRowLastColumn="0"/>
+            </w:pPr>
+            <w:r>
+              <w:t>Erro</w:t>
             </w:r>
           </w:p>
         </w:tc>
@@ -1195,333 +1516,55 @@
     </w:p>
     <w:p>
       <w:pPr>
-        <w:pStyle w:val="Cabealho"/>
-        <w:rPr>
-          <w:b/>
-          <w:bCs/>
-        </w:rPr>
-      </w:pPr>
-    </w:p>
-    <w:p>
-      <w:pPr>
-        <w:pStyle w:val="Cabealho"/>
-        <w:rPr>
-          <w:b/>
-          <w:bCs/>
-        </w:rPr>
-      </w:pPr>
-      <w:r>
-        <w:rPr>
-          <w:b/>
-          <w:bCs/>
-        </w:rPr>
-        <w:t>4. Missões de Teste Exploratório</w:t>
-      </w:r>
-    </w:p>
-    <w:p/>
-    <w:p>
-      <w:r>
-        <w:t>Definir aqui.</w:t>
-      </w:r>
-    </w:p>
-    <w:p/>
-    <w:p>
-      <w:pPr>
-        <w:pStyle w:val="PargrafodaLista"/>
-        <w:numPr>
-          <w:ilvl w:val="0"/>
-          <w:numId w:val="5"/>
-        </w:numPr>
-      </w:pPr>
-      <w:r>
-        <w:t xml:space="preserve">Missão </w:t>
-      </w:r>
-      <w:r>
-        <w:t>1 aqui</w:t>
-      </w:r>
-    </w:p>
-    <w:p>
-      <w:pPr>
-        <w:pStyle w:val="Cabealho"/>
-        <w:rPr>
-          <w:b/>
-          <w:bCs/>
-        </w:rPr>
-      </w:pPr>
-    </w:p>
-    <w:p>
-      <w:pPr>
-        <w:pStyle w:val="Cabealho"/>
-        <w:rPr>
-          <w:b/>
-          <w:bCs/>
-        </w:rPr>
-      </w:pPr>
-      <w:r>
-        <w:rPr>
-          <w:b/>
-          <w:bCs/>
-        </w:rPr>
-        <w:t>5. Testes Não-Funcionais</w:t>
-      </w:r>
-    </w:p>
-    <w:p/>
-    <w:p>
-      <w:r>
-        <w:t>Definir aqui.</w:t>
-      </w:r>
-    </w:p>
-    <w:p/>
-    <w:tbl>
-      <w:tblPr>
-        <w:tblStyle w:val="TabeladeGrade1Clara"/>
-        <w:tblW w:w="0" w:type="auto"/>
-        <w:tblLook w:val="04A0" w:firstRow="1" w:lastRow="0" w:firstColumn="1" w:lastColumn="0" w:noHBand="0" w:noVBand="1"/>
-      </w:tblPr>
-      <w:tblGrid>
-        <w:gridCol w:w="2335"/>
-        <w:gridCol w:w="4320"/>
-        <w:gridCol w:w="2695"/>
-      </w:tblGrid>
-      <w:tr>
-        <w:trPr>
-          <w:cnfStyle w:val="100000000000" w:firstRow="1" w:lastRow="0" w:firstColumn="0" w:lastColumn="0" w:oddVBand="0" w:evenVBand="0" w:oddHBand="0" w:evenHBand="0" w:firstRowFirstColumn="0" w:firstRowLastColumn="0" w:lastRowFirstColumn="0" w:lastRowLastColumn="0"/>
-        </w:trPr>
-        <w:tc>
-          <w:tcPr>
-            <w:cnfStyle w:val="001000000000" w:firstRow="0" w:lastRow="0" w:firstColumn="1" w:lastColumn="0" w:oddVBand="0" w:evenVBand="0" w:oddHBand="0" w:evenHBand="0" w:firstRowFirstColumn="0" w:firstRowLastColumn="0" w:lastRowFirstColumn="0" w:lastRowLastColumn="0"/>
-            <w:tcW w:w="2335" w:type="dxa"/>
-          </w:tcPr>
-          <w:p>
-            <w:r>
-              <w:t>Tipo</w:t>
-            </w:r>
-          </w:p>
-        </w:tc>
-        <w:tc>
-          <w:tcPr>
-            <w:tcW w:w="4320" w:type="dxa"/>
-          </w:tcPr>
-          <w:p>
-            <w:pPr>
-              <w:cnfStyle w:val="100000000000" w:firstRow="1" w:lastRow="0" w:firstColumn="0" w:lastColumn="0" w:oddVBand="0" w:evenVBand="0" w:oddHBand="0" w:evenHBand="0" w:firstRowFirstColumn="0" w:firstRowLastColumn="0" w:lastRowFirstColumn="0" w:lastRowLastColumn="0"/>
-            </w:pPr>
-            <w:r>
-              <w:t>Teste</w:t>
-            </w:r>
-          </w:p>
-        </w:tc>
-        <w:tc>
-          <w:tcPr>
-            <w:tcW w:w="2695" w:type="dxa"/>
-          </w:tcPr>
-          <w:p>
-            <w:pPr>
-              <w:cnfStyle w:val="100000000000" w:firstRow="1" w:lastRow="0" w:firstColumn="0" w:lastColumn="0" w:oddVBand="0" w:evenVBand="0" w:oddHBand="0" w:evenHBand="0" w:firstRowFirstColumn="0" w:firstRowLastColumn="0" w:lastRowFirstColumn="0" w:lastRowLastColumn="0"/>
-            </w:pPr>
-            <w:r>
-              <w:t>Resultado Esperado</w:t>
-            </w:r>
-          </w:p>
-        </w:tc>
-      </w:tr>
-      <w:tr>
-        <w:tc>
-          <w:tcPr>
-            <w:cnfStyle w:val="001000000000" w:firstRow="0" w:lastRow="0" w:firstColumn="1" w:lastColumn="0" w:oddVBand="0" w:evenVBand="0" w:oddHBand="0" w:evenHBand="0" w:firstRowFirstColumn="0" w:firstRowLastColumn="0" w:lastRowFirstColumn="0" w:lastRowLastColumn="0"/>
-            <w:tcW w:w="2335" w:type="dxa"/>
-          </w:tcPr>
-          <w:p>
-            <w:pPr>
-              <w:rPr>
-                <w:b w:val="0"/>
-                <w:bCs w:val="0"/>
-              </w:rPr>
-            </w:pPr>
-            <w:r>
-              <w:rPr>
-                <w:b w:val="0"/>
-                <w:bCs w:val="0"/>
-              </w:rPr>
-              <w:t>Performance</w:t>
-            </w:r>
-          </w:p>
-        </w:tc>
-        <w:tc>
-          <w:tcPr>
-            <w:tcW w:w="4320" w:type="dxa"/>
-          </w:tcPr>
-          <w:p>
-            <w:pPr>
-              <w:cnfStyle w:val="000000000000" w:firstRow="0" w:lastRow="0" w:firstColumn="0" w:lastColumn="0" w:oddVBand="0" w:evenVBand="0" w:oddHBand="0" w:evenHBand="0" w:firstRowFirstColumn="0" w:firstRowLastColumn="0" w:lastRowFirstColumn="0" w:lastRowLastColumn="0"/>
-            </w:pPr>
-            <w:r>
-              <w:t xml:space="preserve">Testar api com 5 mil usuários simultâneos com </w:t>
-            </w:r>
-            <w:proofErr w:type="spellStart"/>
-            <w:r>
-              <w:t>rampap</w:t>
-            </w:r>
-            <w:proofErr w:type="spellEnd"/>
-            <w:r>
-              <w:t xml:space="preserve"> de 3 s</w:t>
-            </w:r>
-          </w:p>
-        </w:tc>
-        <w:tc>
-          <w:tcPr>
-            <w:tcW w:w="2695" w:type="dxa"/>
-          </w:tcPr>
-          <w:p>
-            <w:pPr>
-              <w:cnfStyle w:val="000000000000" w:firstRow="0" w:lastRow="0" w:firstColumn="0" w:lastColumn="0" w:oddVBand="0" w:evenVBand="0" w:oddHBand="0" w:evenHBand="0" w:firstRowFirstColumn="0" w:firstRowLastColumn="0" w:lastRowFirstColumn="0" w:lastRowLastColumn="0"/>
-            </w:pPr>
-            <w:r>
-              <w:t xml:space="preserve">Responda em </w:t>
-            </w:r>
-            <w:proofErr w:type="spellStart"/>
-            <w:r>
-              <w:t>ate</w:t>
-            </w:r>
-            <w:proofErr w:type="spellEnd"/>
-            <w:r>
-              <w:t xml:space="preserve"> 3 s</w:t>
-            </w:r>
-          </w:p>
-        </w:tc>
-      </w:tr>
-      <w:tr>
-        <w:tc>
-          <w:tcPr>
-            <w:cnfStyle w:val="001000000000" w:firstRow="0" w:lastRow="0" w:firstColumn="1" w:lastColumn="0" w:oddVBand="0" w:evenVBand="0" w:oddHBand="0" w:evenHBand="0" w:firstRowFirstColumn="0" w:firstRowLastColumn="0" w:lastRowFirstColumn="0" w:lastRowLastColumn="0"/>
-            <w:tcW w:w="2335" w:type="dxa"/>
-          </w:tcPr>
-          <w:p>
-            <w:pPr>
-              <w:rPr>
-                <w:b w:val="0"/>
-                <w:bCs w:val="0"/>
-              </w:rPr>
-            </w:pPr>
-            <w:r>
-              <w:rPr>
-                <w:b w:val="0"/>
-                <w:bCs w:val="0"/>
-              </w:rPr>
-              <w:t>Acessibilidade</w:t>
-            </w:r>
-          </w:p>
-        </w:tc>
-        <w:tc>
-          <w:tcPr>
-            <w:tcW w:w="4320" w:type="dxa"/>
-          </w:tcPr>
-          <w:p>
-            <w:pPr>
-              <w:cnfStyle w:val="000000000000" w:firstRow="0" w:lastRow="0" w:firstColumn="0" w:lastColumn="0" w:oddVBand="0" w:evenVBand="0" w:oddHBand="0" w:evenHBand="0" w:firstRowFirstColumn="0" w:firstRowLastColumn="0" w:lastRowFirstColumn="0" w:lastRowLastColumn="0"/>
-            </w:pPr>
-          </w:p>
-        </w:tc>
-        <w:tc>
-          <w:tcPr>
-            <w:tcW w:w="2695" w:type="dxa"/>
-          </w:tcPr>
-          <w:p>
-            <w:pPr>
-              <w:cnfStyle w:val="000000000000" w:firstRow="0" w:lastRow="0" w:firstColumn="0" w:lastColumn="0" w:oddVBand="0" w:evenVBand="0" w:oddHBand="0" w:evenHBand="0" w:firstRowFirstColumn="0" w:firstRowLastColumn="0" w:lastRowFirstColumn="0" w:lastRowLastColumn="0"/>
-            </w:pPr>
-          </w:p>
-        </w:tc>
-      </w:tr>
-      <w:tr>
-        <w:tc>
-          <w:tcPr>
-            <w:cnfStyle w:val="001000000000" w:firstRow="0" w:lastRow="0" w:firstColumn="1" w:lastColumn="0" w:oddVBand="0" w:evenVBand="0" w:oddHBand="0" w:evenHBand="0" w:firstRowFirstColumn="0" w:firstRowLastColumn="0" w:lastRowFirstColumn="0" w:lastRowLastColumn="0"/>
-            <w:tcW w:w="2335" w:type="dxa"/>
-          </w:tcPr>
-          <w:p>
-            <w:pPr>
-              <w:rPr>
-                <w:b w:val="0"/>
-                <w:bCs w:val="0"/>
-              </w:rPr>
-            </w:pPr>
-            <w:r>
-              <w:rPr>
-                <w:b w:val="0"/>
-                <w:bCs w:val="0"/>
-              </w:rPr>
-              <w:t>Usabilidade</w:t>
-            </w:r>
-          </w:p>
-        </w:tc>
-        <w:tc>
-          <w:tcPr>
-            <w:tcW w:w="4320" w:type="dxa"/>
-          </w:tcPr>
-          <w:p>
-            <w:pPr>
-              <w:cnfStyle w:val="000000000000" w:firstRow="0" w:lastRow="0" w:firstColumn="0" w:lastColumn="0" w:oddVBand="0" w:evenVBand="0" w:oddHBand="0" w:evenHBand="0" w:firstRowFirstColumn="0" w:firstRowLastColumn="0" w:lastRowFirstColumn="0" w:lastRowLastColumn="0"/>
-            </w:pPr>
-          </w:p>
-        </w:tc>
-        <w:tc>
-          <w:tcPr>
-            <w:tcW w:w="2695" w:type="dxa"/>
-          </w:tcPr>
-          <w:p>
-            <w:pPr>
-              <w:cnfStyle w:val="000000000000" w:firstRow="0" w:lastRow="0" w:firstColumn="0" w:lastColumn="0" w:oddVBand="0" w:evenVBand="0" w:oddHBand="0" w:evenHBand="0" w:firstRowFirstColumn="0" w:firstRowLastColumn="0" w:lastRowFirstColumn="0" w:lastRowLastColumn="0"/>
-            </w:pPr>
-          </w:p>
-        </w:tc>
-      </w:tr>
-    </w:tbl>
-    <w:p>
-      <w:pPr>
-        <w:pStyle w:val="Cabealho"/>
-        <w:rPr>
-          <w:b/>
-          <w:bCs/>
-        </w:rPr>
-      </w:pPr>
-    </w:p>
-    <w:p>
-      <w:pPr>
-        <w:rPr>
-          <w:b/>
-          <w:bCs/>
-        </w:rPr>
-      </w:pPr>
-      <w:r>
-        <w:rPr>
-          <w:b/>
-          <w:bCs/>
-        </w:rPr>
-        <w:br w:type="page"/>
-      </w:r>
-    </w:p>
-    <w:p>
-      <w:pPr>
-        <w:pStyle w:val="Cabealho"/>
-        <w:rPr>
-          <w:b/>
-          <w:bCs/>
-        </w:rPr>
-      </w:pPr>
-      <w:r>
-        <w:rPr>
-          <w:b/>
-          <w:bCs/>
-        </w:rPr>
-        <w:lastRenderedPageBreak/>
-        <w:t>6. Automação de Testes</w:t>
-      </w:r>
-    </w:p>
-    <w:p/>
-    <w:p>
-      <w:r>
-        <w:t>Definir aqui.</w:t>
+        <w:rPr>
+          <w:b/>
+          <w:bCs/>
+        </w:rPr>
+      </w:pPr>
+      <w:r>
+        <w:rPr>
+          <w:b/>
+          <w:bCs/>
+        </w:rPr>
+        <w:t>4</w:t>
+      </w:r>
+      <w:r>
+        <w:rPr>
+          <w:b/>
+          <w:bCs/>
+        </w:rPr>
+        <w:t xml:space="preserve">: Consultar pedido </w:t>
+      </w:r>
+      <w:r>
+        <w:rPr>
+          <w:b/>
+          <w:bCs/>
+        </w:rPr>
+        <w:t>pelo ID com</w:t>
+      </w:r>
+      <w:r>
+        <w:rPr>
+          <w:b/>
+          <w:bCs/>
+        </w:rPr>
+        <w:t xml:space="preserve"> dados válidos e inválidos</w:t>
+      </w:r>
+    </w:p>
+    <w:p>
+      <w:pPr>
+        <w:rPr>
+          <w:b/>
+          <w:bCs/>
+          <w:i/>
+          <w:iCs/>
+        </w:rPr>
+      </w:pPr>
+      <w:r>
+        <w:rPr>
+          <w:b/>
+          <w:bCs/>
+        </w:rPr>
+        <w:t>Pré-requisito: Ser gerente e ter login efetuado</w:t>
       </w:r>
     </w:p>
     <w:p/>
@@ -1598,6 +1641,2000 @@
             <w:cnfStyle w:val="001000000000" w:firstRow="0" w:lastRow="0" w:firstColumn="1" w:lastColumn="0" w:oddVBand="0" w:evenVBand="0" w:oddHBand="0" w:evenHBand="0" w:firstRowFirstColumn="0" w:firstRowLastColumn="0" w:lastRowFirstColumn="0" w:lastRowLastColumn="0"/>
             <w:tcW w:w="895" w:type="dxa"/>
           </w:tcPr>
+          <w:p>
+            <w:r>
+              <w:t>3.1</w:t>
+            </w:r>
+          </w:p>
+        </w:tc>
+        <w:tc>
+          <w:tcPr>
+            <w:tcW w:w="3796" w:type="dxa"/>
+          </w:tcPr>
+          <w:p>
+            <w:pPr>
+              <w:cnfStyle w:val="000000000000" w:firstRow="0" w:lastRow="0" w:firstColumn="0" w:lastColumn="0" w:oddVBand="0" w:evenVBand="0" w:oddHBand="0" w:evenHBand="0" w:firstRowFirstColumn="0" w:firstRowLastColumn="0" w:lastRowFirstColumn="0" w:lastRowLastColumn="0"/>
+            </w:pPr>
+            <w:r>
+              <w:t xml:space="preserve">Consultar pedido </w:t>
+            </w:r>
+            <w:r>
+              <w:t>por ID</w:t>
+            </w:r>
+          </w:p>
+        </w:tc>
+        <w:tc>
+          <w:tcPr>
+            <w:tcW w:w="2438" w:type="dxa"/>
+          </w:tcPr>
+          <w:p>
+            <w:pPr>
+              <w:cnfStyle w:val="000000000000" w:firstRow="0" w:lastRow="0" w:firstColumn="0" w:lastColumn="0" w:oddVBand="0" w:evenVBand="0" w:oddHBand="0" w:evenHBand="0" w:firstRowFirstColumn="0" w:firstRowLastColumn="0" w:lastRowFirstColumn="0" w:lastRowLastColumn="0"/>
+            </w:pPr>
+            <w:proofErr w:type="spellStart"/>
+            <w:r>
+              <w:t>Pass</w:t>
+            </w:r>
+            <w:proofErr w:type="spellEnd"/>
+          </w:p>
+        </w:tc>
+        <w:tc>
+          <w:tcPr>
+            <w:tcW w:w="2221" w:type="dxa"/>
+          </w:tcPr>
+          <w:p>
+            <w:pPr>
+              <w:cnfStyle w:val="000000000000" w:firstRow="0" w:lastRow="0" w:firstColumn="0" w:lastColumn="0" w:oddVBand="0" w:evenVBand="0" w:oddHBand="0" w:evenHBand="0" w:firstRowFirstColumn="0" w:firstRowLastColumn="0" w:lastRowFirstColumn="0" w:lastRowLastColumn="0"/>
+            </w:pPr>
+            <w:r>
+              <w:t>api</w:t>
+            </w:r>
+          </w:p>
+        </w:tc>
+      </w:tr>
+      <w:tr>
+        <w:tc>
+          <w:tcPr>
+            <w:cnfStyle w:val="001000000000" w:firstRow="0" w:lastRow="0" w:firstColumn="1" w:lastColumn="0" w:oddVBand="0" w:evenVBand="0" w:oddHBand="0" w:evenHBand="0" w:firstRowFirstColumn="0" w:firstRowLastColumn="0" w:lastRowFirstColumn="0" w:lastRowLastColumn="0"/>
+            <w:tcW w:w="895" w:type="dxa"/>
+          </w:tcPr>
+          <w:p>
+            <w:r>
+              <w:t>3.2</w:t>
+            </w:r>
+          </w:p>
+        </w:tc>
+        <w:tc>
+          <w:tcPr>
+            <w:tcW w:w="3796" w:type="dxa"/>
+          </w:tcPr>
+          <w:p>
+            <w:pPr>
+              <w:cnfStyle w:val="000000000000" w:firstRow="0" w:lastRow="0" w:firstColumn="0" w:lastColumn="0" w:oddVBand="0" w:evenVBand="0" w:oddHBand="0" w:evenHBand="0" w:firstRowFirstColumn="0" w:firstRowLastColumn="0" w:lastRowFirstColumn="0" w:lastRowLastColumn="0"/>
+            </w:pPr>
+            <w:r>
+              <w:t xml:space="preserve">Consultar pedido </w:t>
+            </w:r>
+            <w:r>
+              <w:t>por ID inexistente</w:t>
+            </w:r>
+          </w:p>
+        </w:tc>
+        <w:tc>
+          <w:tcPr>
+            <w:tcW w:w="2438" w:type="dxa"/>
+          </w:tcPr>
+          <w:p>
+            <w:pPr>
+              <w:cnfStyle w:val="000000000000" w:firstRow="0" w:lastRow="0" w:firstColumn="0" w:lastColumn="0" w:oddVBand="0" w:evenVBand="0" w:oddHBand="0" w:evenHBand="0" w:firstRowFirstColumn="0" w:firstRowLastColumn="0" w:lastRowFirstColumn="0" w:lastRowLastColumn="0"/>
+            </w:pPr>
+            <w:r>
+              <w:t>Erro</w:t>
+            </w:r>
+          </w:p>
+        </w:tc>
+        <w:tc>
+          <w:tcPr>
+            <w:tcW w:w="2221" w:type="dxa"/>
+          </w:tcPr>
+          <w:p>
+            <w:pPr>
+              <w:cnfStyle w:val="000000000000" w:firstRow="0" w:lastRow="0" w:firstColumn="0" w:lastColumn="0" w:oddVBand="0" w:evenVBand="0" w:oddHBand="0" w:evenHBand="0" w:firstRowFirstColumn="0" w:firstRowLastColumn="0" w:lastRowFirstColumn="0" w:lastRowLastColumn="0"/>
+            </w:pPr>
+            <w:r>
+              <w:t>api</w:t>
+            </w:r>
+          </w:p>
+        </w:tc>
+      </w:tr>
+      <w:tr>
+        <w:tc>
+          <w:tcPr>
+            <w:cnfStyle w:val="001000000000" w:firstRow="0" w:lastRow="0" w:firstColumn="1" w:lastColumn="0" w:oddVBand="0" w:evenVBand="0" w:oddHBand="0" w:evenHBand="0" w:firstRowFirstColumn="0" w:firstRowLastColumn="0" w:lastRowFirstColumn="0" w:lastRowLastColumn="0"/>
+            <w:tcW w:w="895" w:type="dxa"/>
+          </w:tcPr>
+          <w:p>
+            <w:r>
+              <w:t>3.3</w:t>
+            </w:r>
+          </w:p>
+        </w:tc>
+        <w:tc>
+          <w:tcPr>
+            <w:tcW w:w="3796" w:type="dxa"/>
+          </w:tcPr>
+          <w:p>
+            <w:pPr>
+              <w:cnfStyle w:val="000000000000" w:firstRow="0" w:lastRow="0" w:firstColumn="0" w:lastColumn="0" w:oddVBand="0" w:evenVBand="0" w:oddHBand="0" w:evenHBand="0" w:firstRowFirstColumn="0" w:firstRowLastColumn="0" w:lastRowFirstColumn="0" w:lastRowLastColumn="0"/>
+            </w:pPr>
+            <w:r>
+              <w:t xml:space="preserve">Consultar pedido </w:t>
+            </w:r>
+            <w:r>
+              <w:t>sem token enviado</w:t>
+            </w:r>
+          </w:p>
+        </w:tc>
+        <w:tc>
+          <w:tcPr>
+            <w:tcW w:w="2438" w:type="dxa"/>
+          </w:tcPr>
+          <w:p>
+            <w:pPr>
+              <w:cnfStyle w:val="000000000000" w:firstRow="0" w:lastRow="0" w:firstColumn="0" w:lastColumn="0" w:oddVBand="0" w:evenVBand="0" w:oddHBand="0" w:evenHBand="0" w:firstRowFirstColumn="0" w:firstRowLastColumn="0" w:lastRowFirstColumn="0" w:lastRowLastColumn="0"/>
+            </w:pPr>
+            <w:r>
+              <w:t>Erro</w:t>
+            </w:r>
+          </w:p>
+        </w:tc>
+        <w:tc>
+          <w:tcPr>
+            <w:tcW w:w="2221" w:type="dxa"/>
+          </w:tcPr>
+          <w:p>
+            <w:pPr>
+              <w:cnfStyle w:val="000000000000" w:firstRow="0" w:lastRow="0" w:firstColumn="0" w:lastColumn="0" w:oddVBand="0" w:evenVBand="0" w:oddHBand="0" w:evenHBand="0" w:firstRowFirstColumn="0" w:firstRowLastColumn="0" w:lastRowFirstColumn="0" w:lastRowLastColumn="0"/>
+            </w:pPr>
+            <w:r>
+              <w:t>api</w:t>
+            </w:r>
+          </w:p>
+        </w:tc>
+      </w:tr>
+    </w:tbl>
+    <w:p>
+      <w:pPr>
+        <w:pStyle w:val="Cabealho"/>
+        <w:rPr>
+          <w:b/>
+          <w:bCs/>
+        </w:rPr>
+      </w:pPr>
+    </w:p>
+    <w:p>
+      <w:pPr>
+        <w:pStyle w:val="Cabealho"/>
+        <w:rPr>
+          <w:b/>
+          <w:bCs/>
+        </w:rPr>
+      </w:pPr>
+    </w:p>
+    <w:p>
+      <w:pPr>
+        <w:rPr>
+          <w:b/>
+          <w:bCs/>
+        </w:rPr>
+      </w:pPr>
+      <w:r>
+        <w:rPr>
+          <w:b/>
+          <w:bCs/>
+        </w:rPr>
+        <w:t>5</w:t>
+      </w:r>
+      <w:r>
+        <w:rPr>
+          <w:b/>
+          <w:bCs/>
+        </w:rPr>
+        <w:t xml:space="preserve">: </w:t>
+      </w:r>
+      <w:r>
+        <w:rPr>
+          <w:b/>
+          <w:bCs/>
+        </w:rPr>
+        <w:t xml:space="preserve">Testar </w:t>
+      </w:r>
+      <w:r>
+        <w:rPr>
+          <w:b/>
+          <w:bCs/>
+        </w:rPr>
+        <w:t xml:space="preserve">pedidos com </w:t>
+      </w:r>
+      <w:r>
+        <w:rPr>
+          <w:b/>
+          <w:bCs/>
+        </w:rPr>
+        <w:t>dados válidos e inválidos</w:t>
+      </w:r>
+    </w:p>
+    <w:p/>
+    <w:tbl>
+      <w:tblPr>
+        <w:tblStyle w:val="TabeladeGrade1Clara"/>
+        <w:tblW w:w="0" w:type="auto"/>
+        <w:tblLook w:val="04A0" w:firstRow="1" w:lastRow="0" w:firstColumn="1" w:lastColumn="0" w:noHBand="0" w:noVBand="1"/>
+      </w:tblPr>
+      <w:tblGrid>
+        <w:gridCol w:w="895"/>
+        <w:gridCol w:w="3796"/>
+        <w:gridCol w:w="2438"/>
+        <w:gridCol w:w="2221"/>
+      </w:tblGrid>
+      <w:tr>
+        <w:trPr>
+          <w:cnfStyle w:val="100000000000" w:firstRow="1" w:lastRow="0" w:firstColumn="0" w:lastColumn="0" w:oddVBand="0" w:evenVBand="0" w:oddHBand="0" w:evenHBand="0" w:firstRowFirstColumn="0" w:firstRowLastColumn="0" w:lastRowFirstColumn="0" w:lastRowLastColumn="0"/>
+        </w:trPr>
+        <w:tc>
+          <w:tcPr>
+            <w:cnfStyle w:val="001000000000" w:firstRow="0" w:lastRow="0" w:firstColumn="1" w:lastColumn="0" w:oddVBand="0" w:evenVBand="0" w:oddHBand="0" w:evenHBand="0" w:firstRowFirstColumn="0" w:firstRowLastColumn="0" w:lastRowFirstColumn="0" w:lastRowLastColumn="0"/>
+            <w:tcW w:w="895" w:type="dxa"/>
+          </w:tcPr>
+          <w:p>
+            <w:r>
+              <w:t>ID</w:t>
+            </w:r>
+          </w:p>
+        </w:tc>
+        <w:tc>
+          <w:tcPr>
+            <w:tcW w:w="3796" w:type="dxa"/>
+          </w:tcPr>
+          <w:p>
+            <w:pPr>
+              <w:cnfStyle w:val="100000000000" w:firstRow="1" w:lastRow="0" w:firstColumn="0" w:lastColumn="0" w:oddVBand="0" w:evenVBand="0" w:oddHBand="0" w:evenHBand="0" w:firstRowFirstColumn="0" w:firstRowLastColumn="0" w:lastRowFirstColumn="0" w:lastRowLastColumn="0"/>
+            </w:pPr>
+            <w:r>
+              <w:t>Condição</w:t>
+            </w:r>
+          </w:p>
+        </w:tc>
+        <w:tc>
+          <w:tcPr>
+            <w:tcW w:w="2438" w:type="dxa"/>
+          </w:tcPr>
+          <w:p>
+            <w:pPr>
+              <w:cnfStyle w:val="100000000000" w:firstRow="1" w:lastRow="0" w:firstColumn="0" w:lastColumn="0" w:oddVBand="0" w:evenVBand="0" w:oddHBand="0" w:evenHBand="0" w:firstRowFirstColumn="0" w:firstRowLastColumn="0" w:lastRowFirstColumn="0" w:lastRowLastColumn="0"/>
+            </w:pPr>
+            <w:r>
+              <w:t>Resultado Esperado</w:t>
+            </w:r>
+          </w:p>
+        </w:tc>
+        <w:tc>
+          <w:tcPr>
+            <w:tcW w:w="2221" w:type="dxa"/>
+          </w:tcPr>
+          <w:p>
+            <w:pPr>
+              <w:cnfStyle w:val="100000000000" w:firstRow="1" w:lastRow="0" w:firstColumn="0" w:lastColumn="0" w:oddVBand="0" w:evenVBand="0" w:oddHBand="0" w:evenHBand="0" w:firstRowFirstColumn="0" w:firstRowLastColumn="0" w:lastRowFirstColumn="0" w:lastRowLastColumn="0"/>
+            </w:pPr>
+            <w:r>
+              <w:t>Camada</w:t>
+            </w:r>
+          </w:p>
+        </w:tc>
+      </w:tr>
+      <w:tr>
+        <w:tc>
+          <w:tcPr>
+            <w:cnfStyle w:val="001000000000" w:firstRow="0" w:lastRow="0" w:firstColumn="1" w:lastColumn="0" w:oddVBand="0" w:evenVBand="0" w:oddHBand="0" w:evenHBand="0" w:firstRowFirstColumn="0" w:firstRowLastColumn="0" w:lastRowFirstColumn="0" w:lastRowLastColumn="0"/>
+            <w:tcW w:w="895" w:type="dxa"/>
+          </w:tcPr>
+          <w:p>
+            <w:r>
+              <w:t>1.1</w:t>
+            </w:r>
+          </w:p>
+        </w:tc>
+        <w:tc>
+          <w:tcPr>
+            <w:tcW w:w="3796" w:type="dxa"/>
+          </w:tcPr>
+          <w:p>
+            <w:pPr>
+              <w:cnfStyle w:val="000000000000" w:firstRow="0" w:lastRow="0" w:firstColumn="0" w:lastColumn="0" w:oddVBand="0" w:evenVBand="0" w:oddHBand="0" w:evenHBand="0" w:firstRowFirstColumn="0" w:firstRowLastColumn="0" w:lastRowFirstColumn="0" w:lastRowLastColumn="0"/>
+            </w:pPr>
+            <w:r>
+              <w:t>Preencher pedido sem</w:t>
+            </w:r>
+            <w:r>
+              <w:t xml:space="preserve"> um dos dados obrigatórios mesa ou item</w:t>
+            </w:r>
+          </w:p>
+        </w:tc>
+        <w:tc>
+          <w:tcPr>
+            <w:tcW w:w="2438" w:type="dxa"/>
+          </w:tcPr>
+          <w:p>
+            <w:pPr>
+              <w:cnfStyle w:val="000000000000" w:firstRow="0" w:lastRow="0" w:firstColumn="0" w:lastColumn="0" w:oddVBand="0" w:evenVBand="0" w:oddHBand="0" w:evenHBand="0" w:firstRowFirstColumn="0" w:firstRowLastColumn="0" w:lastRowFirstColumn="0" w:lastRowLastColumn="0"/>
+            </w:pPr>
+            <w:proofErr w:type="spellStart"/>
+            <w:r>
+              <w:t>Pass</w:t>
+            </w:r>
+            <w:proofErr w:type="spellEnd"/>
+          </w:p>
+        </w:tc>
+        <w:tc>
+          <w:tcPr>
+            <w:tcW w:w="2221" w:type="dxa"/>
+          </w:tcPr>
+          <w:p>
+            <w:pPr>
+              <w:cnfStyle w:val="000000000000" w:firstRow="0" w:lastRow="0" w:firstColumn="0" w:lastColumn="0" w:oddVBand="0" w:evenVBand="0" w:oddHBand="0" w:evenHBand="0" w:firstRowFirstColumn="0" w:firstRowLastColumn="0" w:lastRowFirstColumn="0" w:lastRowLastColumn="0"/>
+            </w:pPr>
+            <w:r>
+              <w:t>Api, web</w:t>
+            </w:r>
+          </w:p>
+        </w:tc>
+      </w:tr>
+      <w:tr>
+        <w:tc>
+          <w:tcPr>
+            <w:cnfStyle w:val="001000000000" w:firstRow="0" w:lastRow="0" w:firstColumn="1" w:lastColumn="0" w:oddVBand="0" w:evenVBand="0" w:oddHBand="0" w:evenHBand="0" w:firstRowFirstColumn="0" w:firstRowLastColumn="0" w:lastRowFirstColumn="0" w:lastRowLastColumn="0"/>
+            <w:tcW w:w="895" w:type="dxa"/>
+          </w:tcPr>
+          <w:p>
+            <w:r>
+              <w:t>1.2</w:t>
+            </w:r>
+          </w:p>
+        </w:tc>
+        <w:tc>
+          <w:tcPr>
+            <w:tcW w:w="3796" w:type="dxa"/>
+          </w:tcPr>
+          <w:p>
+            <w:pPr>
+              <w:cnfStyle w:val="000000000000" w:firstRow="0" w:lastRow="0" w:firstColumn="0" w:lastColumn="0" w:oddVBand="0" w:evenVBand="0" w:oddHBand="0" w:evenHBand="0" w:firstRowFirstColumn="0" w:firstRowLastColumn="0" w:lastRowFirstColumn="0" w:lastRowLastColumn="0"/>
+            </w:pPr>
+            <w:r>
+              <w:t>Preencher com usuário inválido. EX: nome: Rodrigo, senha: 123456</w:t>
+            </w:r>
+          </w:p>
+        </w:tc>
+        <w:tc>
+          <w:tcPr>
+            <w:tcW w:w="2438" w:type="dxa"/>
+          </w:tcPr>
+          <w:p>
+            <w:pPr>
+              <w:cnfStyle w:val="000000000000" w:firstRow="0" w:lastRow="0" w:firstColumn="0" w:lastColumn="0" w:oddVBand="0" w:evenVBand="0" w:oddHBand="0" w:evenHBand="0" w:firstRowFirstColumn="0" w:firstRowLastColumn="0" w:lastRowFirstColumn="0" w:lastRowLastColumn="0"/>
+            </w:pPr>
+            <w:proofErr w:type="spellStart"/>
+            <w:r>
+              <w:t>Pass</w:t>
+            </w:r>
+            <w:proofErr w:type="spellEnd"/>
+          </w:p>
+        </w:tc>
+        <w:tc>
+          <w:tcPr>
+            <w:tcW w:w="2221" w:type="dxa"/>
+          </w:tcPr>
+          <w:p>
+            <w:pPr>
+              <w:cnfStyle w:val="000000000000" w:firstRow="0" w:lastRow="0" w:firstColumn="0" w:lastColumn="0" w:oddVBand="0" w:evenVBand="0" w:oddHBand="0" w:evenHBand="0" w:firstRowFirstColumn="0" w:firstRowLastColumn="0" w:lastRowFirstColumn="0" w:lastRowLastColumn="0"/>
+            </w:pPr>
+            <w:r>
+              <w:t>Api, web</w:t>
+            </w:r>
+          </w:p>
+        </w:tc>
+      </w:tr>
+    </w:tbl>
+    <w:p>
+      <w:pPr>
+        <w:pStyle w:val="Cabealho"/>
+        <w:rPr>
+          <w:b/>
+          <w:bCs/>
+        </w:rPr>
+      </w:pPr>
+    </w:p>
+    <w:p>
+      <w:pPr>
+        <w:pStyle w:val="Cabealho"/>
+        <w:rPr>
+          <w:b/>
+          <w:bCs/>
+        </w:rPr>
+      </w:pPr>
+    </w:p>
+    <w:p>
+      <w:pPr>
+        <w:pStyle w:val="Cabealho"/>
+        <w:rPr>
+          <w:b/>
+          <w:bCs/>
+        </w:rPr>
+      </w:pPr>
+      <w:r>
+        <w:rPr>
+          <w:b/>
+          <w:bCs/>
+        </w:rPr>
+        <w:t>4. Missões de Teste Exploratório</w:t>
+      </w:r>
+    </w:p>
+    <w:p/>
+    <w:p>
+      <w:pPr>
+        <w:pStyle w:val="Cabealho"/>
+        <w:rPr>
+          <w:b/>
+          <w:bCs/>
+        </w:rPr>
+      </w:pPr>
+      <w:r>
+        <w:rPr>
+          <w:b/>
+          <w:bCs/>
+        </w:rPr>
+        <w:t>4.1 Objetivo</w:t>
+      </w:r>
+    </w:p>
+    <w:p>
+      <w:pPr>
+        <w:pStyle w:val="Cabealho"/>
+      </w:pPr>
+      <w:r>
+        <w:t xml:space="preserve">Realizar sessões de testes exploratórios na API de pedidos de restaurante, com o propósito de identificar defeitos funcionais, falhas de validação, inconsistências de resposta e oportunidades de melhoria na experiência do desenvolvedor (API </w:t>
+      </w:r>
+      <w:proofErr w:type="spellStart"/>
+      <w:r>
+        <w:t>usability</w:t>
+      </w:r>
+      <w:proofErr w:type="spellEnd"/>
+      <w:r>
+        <w:t>).</w:t>
+      </w:r>
+    </w:p>
+    <w:p>
+      <w:pPr>
+        <w:pStyle w:val="Cabealho"/>
+      </w:pPr>
+      <w:r>
+        <w:pict w14:anchorId="7358EC79">
+          <v:rect id="_x0000_i1025" style="width:0;height:1.5pt" o:hralign="center" o:hrstd="t" o:hr="t" fillcolor="#a0a0a0" stroked="f"/>
+        </w:pict>
+      </w:r>
+    </w:p>
+    <w:p>
+      <w:pPr>
+        <w:pStyle w:val="Cabealho"/>
+        <w:rPr>
+          <w:b/>
+          <w:bCs/>
+        </w:rPr>
+      </w:pPr>
+    </w:p>
+    <w:p>
+      <w:pPr>
+        <w:pStyle w:val="Cabealho"/>
+        <w:rPr>
+          <w:b/>
+          <w:bCs/>
+        </w:rPr>
+      </w:pPr>
+      <w:r>
+        <w:rPr>
+          <w:b/>
+          <w:bCs/>
+        </w:rPr>
+        <w:t>4.2 Escopo</w:t>
+      </w:r>
+    </w:p>
+    <w:p>
+      <w:pPr>
+        <w:pStyle w:val="Cabealho"/>
+      </w:pPr>
+      <w:r>
+        <w:t xml:space="preserve">Os testes exploratórios cobrem os principais </w:t>
+      </w:r>
+      <w:proofErr w:type="spellStart"/>
+      <w:r>
+        <w:t>endpoints</w:t>
+      </w:r>
+      <w:proofErr w:type="spellEnd"/>
+      <w:r>
+        <w:t xml:space="preserve"> da aplicação, incluindo:</w:t>
+      </w:r>
+    </w:p>
+    <w:p>
+      <w:pPr>
+        <w:pStyle w:val="Cabealho"/>
+        <w:numPr>
+          <w:ilvl w:val="0"/>
+          <w:numId w:val="7"/>
+        </w:numPr>
+      </w:pPr>
+      <w:r>
+        <w:t>/api/login</w:t>
+      </w:r>
+    </w:p>
+    <w:p>
+      <w:pPr>
+        <w:pStyle w:val="Cabealho"/>
+        <w:numPr>
+          <w:ilvl w:val="0"/>
+          <w:numId w:val="7"/>
+        </w:numPr>
+      </w:pPr>
+      <w:r>
+        <w:t>/api/pedidos</w:t>
+      </w:r>
+    </w:p>
+    <w:p>
+      <w:pPr>
+        <w:pStyle w:val="Cabealho"/>
+        <w:numPr>
+          <w:ilvl w:val="0"/>
+          <w:numId w:val="7"/>
+        </w:numPr>
+      </w:pPr>
+      <w:r>
+        <w:t>/api/pedidos/{id}/tempo</w:t>
+      </w:r>
+    </w:p>
+    <w:p>
+      <w:pPr>
+        <w:pStyle w:val="Cabealho"/>
+        <w:numPr>
+          <w:ilvl w:val="0"/>
+          <w:numId w:val="7"/>
+        </w:numPr>
+      </w:pPr>
+      <w:r>
+        <w:t>/api/pedidos/{id}/status</w:t>
+      </w:r>
+    </w:p>
+    <w:p>
+      <w:pPr>
+        <w:pStyle w:val="Cabealho"/>
+      </w:pPr>
+      <w:r>
+        <w:t>As sessões serão conduzidas em ambiente de homologação, com foco na validação de comportamento sob diferentes entradas, combinações e cenários não previamente especificados em testes automatizados.</w:t>
+      </w:r>
+    </w:p>
+    <w:p>
+      <w:pPr>
+        <w:pStyle w:val="Cabealho"/>
+      </w:pPr>
+      <w:r>
+        <w:pict w14:anchorId="3574E5A7">
+          <v:rect id="_x0000_i1026" style="width:0;height:1.5pt" o:hralign="center" o:hrstd="t" o:hr="t" fillcolor="#a0a0a0" stroked="f"/>
+        </w:pict>
+      </w:r>
+    </w:p>
+    <w:p>
+      <w:pPr>
+        <w:pStyle w:val="Cabealho"/>
+        <w:rPr>
+          <w:b/>
+          <w:bCs/>
+        </w:rPr>
+      </w:pPr>
+    </w:p>
+    <w:p>
+      <w:pPr>
+        <w:pStyle w:val="Cabealho"/>
+        <w:rPr>
+          <w:b/>
+          <w:bCs/>
+        </w:rPr>
+      </w:pPr>
+      <w:r>
+        <w:rPr>
+          <w:b/>
+          <w:bCs/>
+        </w:rPr>
+        <w:t>4.3 Técnica de Teste</w:t>
+      </w:r>
+    </w:p>
+    <w:p>
+      <w:pPr>
+        <w:pStyle w:val="Cabealho"/>
+      </w:pPr>
+      <w:r>
+        <w:t xml:space="preserve">Será utilizada a técnica </w:t>
+      </w:r>
+      <w:r>
+        <w:rPr>
+          <w:b/>
+          <w:bCs/>
+        </w:rPr>
+        <w:t>Exploratória Baseada em Sessões (</w:t>
+      </w:r>
+      <w:proofErr w:type="spellStart"/>
+      <w:r>
+        <w:rPr>
+          <w:b/>
+          <w:bCs/>
+        </w:rPr>
+        <w:t>Session-Based</w:t>
+      </w:r>
+      <w:proofErr w:type="spellEnd"/>
+      <w:r>
+        <w:rPr>
+          <w:b/>
+          <w:bCs/>
+        </w:rPr>
+        <w:t xml:space="preserve"> </w:t>
+      </w:r>
+      <w:proofErr w:type="spellStart"/>
+      <w:r>
+        <w:rPr>
+          <w:b/>
+          <w:bCs/>
+        </w:rPr>
+        <w:t>Testing</w:t>
+      </w:r>
+      <w:proofErr w:type="spellEnd"/>
+      <w:r>
+        <w:rPr>
+          <w:b/>
+          <w:bCs/>
+        </w:rPr>
+        <w:t xml:space="preserve"> - SBT)</w:t>
+      </w:r>
+      <w:r>
+        <w:t>:</w:t>
+      </w:r>
+    </w:p>
+    <w:p>
+      <w:pPr>
+        <w:pStyle w:val="Cabealho"/>
+        <w:numPr>
+          <w:ilvl w:val="0"/>
+          <w:numId w:val="8"/>
+        </w:numPr>
+      </w:pPr>
+      <w:r>
+        <w:t xml:space="preserve">Duração sugerida: </w:t>
+      </w:r>
+      <w:r>
+        <w:rPr>
+          <w:b/>
+          <w:bCs/>
+        </w:rPr>
+        <w:t>30 a 45 minutos por sessão</w:t>
+      </w:r>
+    </w:p>
+    <w:p>
+      <w:pPr>
+        <w:pStyle w:val="Cabealho"/>
+        <w:numPr>
+          <w:ilvl w:val="0"/>
+          <w:numId w:val="8"/>
+        </w:numPr>
+      </w:pPr>
+      <w:r>
+        <w:t>Cada sessão deve gerar:</w:t>
+      </w:r>
+    </w:p>
+    <w:p>
+      <w:pPr>
+        <w:pStyle w:val="Cabealho"/>
+        <w:numPr>
+          <w:ilvl w:val="1"/>
+          <w:numId w:val="8"/>
+        </w:numPr>
+      </w:pPr>
+      <w:r>
+        <w:t>Relato das observações (notas)</w:t>
+      </w:r>
+    </w:p>
+    <w:p>
+      <w:pPr>
+        <w:pStyle w:val="Cabealho"/>
+        <w:numPr>
+          <w:ilvl w:val="1"/>
+          <w:numId w:val="8"/>
+        </w:numPr>
+      </w:pPr>
+      <w:r>
+        <w:t>Lista de defeitos encontrados</w:t>
+      </w:r>
+    </w:p>
+    <w:p>
+      <w:pPr>
+        <w:pStyle w:val="Cabealho"/>
+        <w:numPr>
+          <w:ilvl w:val="1"/>
+          <w:numId w:val="8"/>
+        </w:numPr>
+      </w:pPr>
+      <w:r>
+        <w:t>Sugestões de melhoria (quando aplicável)</w:t>
+      </w:r>
+    </w:p>
+    <w:p>
+      <w:pPr>
+        <w:pStyle w:val="Cabealho"/>
+      </w:pPr>
+      <w:r>
+        <w:pict w14:anchorId="609B0FB5">
+          <v:rect id="_x0000_i1027" style="width:0;height:1.5pt" o:hralign="center" o:hrstd="t" o:hr="t" fillcolor="#a0a0a0" stroked="f"/>
+        </w:pict>
+      </w:r>
+    </w:p>
+    <w:p>
+      <w:pPr>
+        <w:pStyle w:val="Cabealho"/>
+        <w:rPr>
+          <w:b/>
+          <w:bCs/>
+        </w:rPr>
+      </w:pPr>
+    </w:p>
+    <w:p>
+      <w:pPr>
+        <w:pStyle w:val="Cabealho"/>
+        <w:rPr>
+          <w:b/>
+          <w:bCs/>
+        </w:rPr>
+      </w:pPr>
+      <w:r>
+        <w:rPr>
+          <w:b/>
+          <w:bCs/>
+        </w:rPr>
+        <w:t>4.4 Critérios de Conclusão</w:t>
+      </w:r>
+    </w:p>
+    <w:p>
+      <w:pPr>
+        <w:pStyle w:val="Cabealho"/>
+      </w:pPr>
+      <w:r>
+        <w:t>Uma missão exploratória é considerada concluída quando:</w:t>
+      </w:r>
+    </w:p>
+    <w:p>
+      <w:pPr>
+        <w:pStyle w:val="Cabealho"/>
+        <w:numPr>
+          <w:ilvl w:val="0"/>
+          <w:numId w:val="9"/>
+        </w:numPr>
+      </w:pPr>
+      <w:r>
+        <w:t>Todos os cenários descritos na missão foram investigados.</w:t>
+      </w:r>
+    </w:p>
+    <w:p>
+      <w:pPr>
+        <w:pStyle w:val="Cabealho"/>
+        <w:numPr>
+          <w:ilvl w:val="0"/>
+          <w:numId w:val="9"/>
+        </w:numPr>
+      </w:pPr>
+      <w:r>
+        <w:t>O testador registrou as anomalias encontradas e evidências relevantes.</w:t>
+      </w:r>
+    </w:p>
+    <w:p>
+      <w:pPr>
+        <w:pStyle w:val="Cabealho"/>
+        <w:numPr>
+          <w:ilvl w:val="0"/>
+          <w:numId w:val="9"/>
+        </w:numPr>
+      </w:pPr>
+      <w:r>
+        <w:t>As observações foram revisadas pela equipe de QA ou líder técnico.</w:t>
+      </w:r>
+    </w:p>
+    <w:p>
+      <w:pPr>
+        <w:pStyle w:val="Cabealho"/>
+      </w:pPr>
+    </w:p>
+    <w:p>
+      <w:pPr>
+        <w:pStyle w:val="Cabealho"/>
+        <w:rPr>
+          <w:b/>
+          <w:bCs/>
+        </w:rPr>
+      </w:pPr>
+    </w:p>
+    <w:p>
+      <w:pPr>
+        <w:pStyle w:val="Cabealho"/>
+        <w:rPr>
+          <w:b/>
+          <w:bCs/>
+        </w:rPr>
+      </w:pPr>
+      <w:r>
+        <w:rPr>
+          <w:b/>
+          <w:bCs/>
+        </w:rPr>
+        <w:t>4.5 Missões de Teste Exploratório</w:t>
+      </w:r>
+    </w:p>
+    <w:p>
+      <w:pPr>
+        <w:pStyle w:val="Cabealho"/>
+        <w:rPr>
+          <w:b/>
+          <w:bCs/>
+        </w:rPr>
+      </w:pPr>
+    </w:p>
+    <w:tbl>
+      <w:tblPr>
+        <w:tblW w:w="0" w:type="auto"/>
+        <w:tblCellSpacing w:w="15" w:type="dxa"/>
+        <w:tblCellMar>
+          <w:top w:w="15" w:type="dxa"/>
+          <w:left w:w="15" w:type="dxa"/>
+          <w:bottom w:w="15" w:type="dxa"/>
+          <w:right w:w="15" w:type="dxa"/>
+        </w:tblCellMar>
+        <w:tblLook w:val="04A0" w:firstRow="1" w:lastRow="0" w:firstColumn="1" w:lastColumn="0" w:noHBand="0" w:noVBand="1"/>
+      </w:tblPr>
+      <w:tblGrid>
+        <w:gridCol w:w="421"/>
+        <w:gridCol w:w="2262"/>
+        <w:gridCol w:w="3489"/>
+        <w:gridCol w:w="3178"/>
+      </w:tblGrid>
+      <w:tr>
+        <w:trPr>
+          <w:tblHeader/>
+          <w:tblCellSpacing w:w="15" w:type="dxa"/>
+        </w:trPr>
+        <w:tc>
+          <w:tcPr>
+            <w:tcW w:w="0" w:type="auto"/>
+            <w:tcBorders>
+              <w:top w:val="single" w:sz="4" w:space="0" w:color="auto"/>
+              <w:left w:val="single" w:sz="4" w:space="0" w:color="auto"/>
+              <w:bottom w:val="single" w:sz="4" w:space="0" w:color="auto"/>
+              <w:right w:val="single" w:sz="4" w:space="0" w:color="auto"/>
+            </w:tcBorders>
+            <w:vAlign w:val="center"/>
+            <w:hideMark/>
+          </w:tcPr>
+          <w:p>
+            <w:pPr>
+              <w:pStyle w:val="Cabealho"/>
+              <w:rPr>
+                <w:b/>
+                <w:bCs/>
+              </w:rPr>
+            </w:pPr>
+            <w:r>
+              <w:rPr>
+                <w:b/>
+                <w:bCs/>
+              </w:rPr>
+              <w:t>ID</w:t>
+            </w:r>
+          </w:p>
+        </w:tc>
+        <w:tc>
+          <w:tcPr>
+            <w:tcW w:w="0" w:type="auto"/>
+            <w:tcBorders>
+              <w:top w:val="single" w:sz="4" w:space="0" w:color="auto"/>
+              <w:left w:val="single" w:sz="4" w:space="0" w:color="auto"/>
+              <w:bottom w:val="single" w:sz="4" w:space="0" w:color="auto"/>
+              <w:right w:val="single" w:sz="4" w:space="0" w:color="auto"/>
+            </w:tcBorders>
+            <w:vAlign w:val="center"/>
+            <w:hideMark/>
+          </w:tcPr>
+          <w:p>
+            <w:pPr>
+              <w:pStyle w:val="Cabealho"/>
+              <w:rPr>
+                <w:b/>
+                <w:bCs/>
+              </w:rPr>
+            </w:pPr>
+            <w:r>
+              <w:rPr>
+                <w:b/>
+                <w:bCs/>
+              </w:rPr>
+              <w:t>Missão</w:t>
+            </w:r>
+          </w:p>
+        </w:tc>
+        <w:tc>
+          <w:tcPr>
+            <w:tcW w:w="0" w:type="auto"/>
+            <w:tcBorders>
+              <w:top w:val="single" w:sz="4" w:space="0" w:color="auto"/>
+              <w:left w:val="single" w:sz="4" w:space="0" w:color="auto"/>
+              <w:bottom w:val="single" w:sz="4" w:space="0" w:color="auto"/>
+              <w:right w:val="single" w:sz="4" w:space="0" w:color="auto"/>
+            </w:tcBorders>
+            <w:vAlign w:val="center"/>
+            <w:hideMark/>
+          </w:tcPr>
+          <w:p>
+            <w:pPr>
+              <w:pStyle w:val="Cabealho"/>
+              <w:rPr>
+                <w:b/>
+                <w:bCs/>
+              </w:rPr>
+            </w:pPr>
+            <w:r>
+              <w:rPr>
+                <w:b/>
+                <w:bCs/>
+              </w:rPr>
+              <w:t>Descrição</w:t>
+            </w:r>
+          </w:p>
+        </w:tc>
+        <w:tc>
+          <w:tcPr>
+            <w:tcW w:w="0" w:type="auto"/>
+            <w:tcBorders>
+              <w:top w:val="single" w:sz="4" w:space="0" w:color="auto"/>
+              <w:left w:val="single" w:sz="4" w:space="0" w:color="auto"/>
+              <w:bottom w:val="single" w:sz="4" w:space="0" w:color="auto"/>
+              <w:right w:val="single" w:sz="4" w:space="0" w:color="auto"/>
+            </w:tcBorders>
+            <w:vAlign w:val="center"/>
+            <w:hideMark/>
+          </w:tcPr>
+          <w:p>
+            <w:pPr>
+              <w:pStyle w:val="Cabealho"/>
+              <w:rPr>
+                <w:b/>
+                <w:bCs/>
+              </w:rPr>
+            </w:pPr>
+            <w:r>
+              <w:rPr>
+                <w:b/>
+                <w:bCs/>
+              </w:rPr>
+              <w:t>Critério de Sucesso</w:t>
+            </w:r>
+          </w:p>
+        </w:tc>
+      </w:tr>
+      <w:tr>
+        <w:trPr>
+          <w:tblCellSpacing w:w="15" w:type="dxa"/>
+        </w:trPr>
+        <w:tc>
+          <w:tcPr>
+            <w:tcW w:w="0" w:type="auto"/>
+            <w:tcBorders>
+              <w:top w:val="single" w:sz="4" w:space="0" w:color="auto"/>
+              <w:left w:val="single" w:sz="4" w:space="0" w:color="auto"/>
+              <w:bottom w:val="single" w:sz="4" w:space="0" w:color="auto"/>
+              <w:right w:val="single" w:sz="4" w:space="0" w:color="auto"/>
+            </w:tcBorders>
+            <w:vAlign w:val="center"/>
+            <w:hideMark/>
+          </w:tcPr>
+          <w:p>
+            <w:pPr>
+              <w:pStyle w:val="Cabealho"/>
+            </w:pPr>
+            <w:r>
+              <w:rPr>
+                <w:b/>
+                <w:bCs/>
+              </w:rPr>
+              <w:t>M1</w:t>
+            </w:r>
+          </w:p>
+        </w:tc>
+        <w:tc>
+          <w:tcPr>
+            <w:tcW w:w="0" w:type="auto"/>
+            <w:tcBorders>
+              <w:top w:val="single" w:sz="4" w:space="0" w:color="auto"/>
+              <w:left w:val="single" w:sz="4" w:space="0" w:color="auto"/>
+              <w:bottom w:val="single" w:sz="4" w:space="0" w:color="auto"/>
+              <w:right w:val="single" w:sz="4" w:space="0" w:color="auto"/>
+            </w:tcBorders>
+            <w:vAlign w:val="center"/>
+            <w:hideMark/>
+          </w:tcPr>
+          <w:p>
+            <w:pPr>
+              <w:pStyle w:val="Cabealho"/>
+            </w:pPr>
+            <w:r>
+              <w:rPr>
+                <w:b/>
+                <w:bCs/>
+              </w:rPr>
+              <w:t>Autenticação e segurança</w:t>
+            </w:r>
+          </w:p>
+        </w:tc>
+        <w:tc>
+          <w:tcPr>
+            <w:tcW w:w="0" w:type="auto"/>
+            <w:tcBorders>
+              <w:top w:val="single" w:sz="4" w:space="0" w:color="auto"/>
+              <w:left w:val="single" w:sz="4" w:space="0" w:color="auto"/>
+              <w:bottom w:val="single" w:sz="4" w:space="0" w:color="auto"/>
+              <w:right w:val="single" w:sz="4" w:space="0" w:color="auto"/>
+            </w:tcBorders>
+            <w:vAlign w:val="center"/>
+            <w:hideMark/>
+          </w:tcPr>
+          <w:p>
+            <w:pPr>
+              <w:pStyle w:val="Cabealho"/>
+            </w:pPr>
+            <w:r>
+              <w:t xml:space="preserve">Explorar o login e o uso do token de acesso, testando credenciais </w:t>
+            </w:r>
+            <w:r>
+              <w:lastRenderedPageBreak/>
+              <w:t>inválidas, tokens expirados e ausência de autenticação.</w:t>
+            </w:r>
+          </w:p>
+        </w:tc>
+        <w:tc>
+          <w:tcPr>
+            <w:tcW w:w="0" w:type="auto"/>
+            <w:tcBorders>
+              <w:top w:val="single" w:sz="4" w:space="0" w:color="auto"/>
+              <w:left w:val="single" w:sz="4" w:space="0" w:color="auto"/>
+              <w:bottom w:val="single" w:sz="4" w:space="0" w:color="auto"/>
+              <w:right w:val="single" w:sz="4" w:space="0" w:color="auto"/>
+            </w:tcBorders>
+            <w:vAlign w:val="center"/>
+            <w:hideMark/>
+          </w:tcPr>
+          <w:p>
+            <w:pPr>
+              <w:pStyle w:val="Cabealho"/>
+            </w:pPr>
+            <w:r>
+              <w:lastRenderedPageBreak/>
+              <w:t xml:space="preserve">A API deve rejeitar acessos não autorizados com </w:t>
+            </w:r>
+            <w:r>
+              <w:lastRenderedPageBreak/>
+              <w:t>mensagens claras e códigos HTTP adequados (401/403).</w:t>
+            </w:r>
+          </w:p>
+        </w:tc>
+      </w:tr>
+      <w:tr>
+        <w:trPr>
+          <w:tblCellSpacing w:w="15" w:type="dxa"/>
+        </w:trPr>
+        <w:tc>
+          <w:tcPr>
+            <w:tcW w:w="0" w:type="auto"/>
+            <w:tcBorders>
+              <w:top w:val="single" w:sz="4" w:space="0" w:color="auto"/>
+              <w:left w:val="single" w:sz="4" w:space="0" w:color="auto"/>
+              <w:bottom w:val="single" w:sz="4" w:space="0" w:color="auto"/>
+              <w:right w:val="single" w:sz="4" w:space="0" w:color="auto"/>
+            </w:tcBorders>
+            <w:vAlign w:val="center"/>
+            <w:hideMark/>
+          </w:tcPr>
+          <w:p>
+            <w:pPr>
+              <w:pStyle w:val="Cabealho"/>
+            </w:pPr>
+            <w:r>
+              <w:rPr>
+                <w:b/>
+                <w:bCs/>
+              </w:rPr>
+              <w:lastRenderedPageBreak/>
+              <w:t>M2</w:t>
+            </w:r>
+          </w:p>
+        </w:tc>
+        <w:tc>
+          <w:tcPr>
+            <w:tcW w:w="0" w:type="auto"/>
+            <w:tcBorders>
+              <w:top w:val="single" w:sz="4" w:space="0" w:color="auto"/>
+              <w:left w:val="single" w:sz="4" w:space="0" w:color="auto"/>
+              <w:bottom w:val="single" w:sz="4" w:space="0" w:color="auto"/>
+              <w:right w:val="single" w:sz="4" w:space="0" w:color="auto"/>
+            </w:tcBorders>
+            <w:vAlign w:val="center"/>
+            <w:hideMark/>
+          </w:tcPr>
+          <w:p>
+            <w:pPr>
+              <w:pStyle w:val="Cabealho"/>
+            </w:pPr>
+            <w:r>
+              <w:rPr>
+                <w:b/>
+                <w:bCs/>
+              </w:rPr>
+              <w:t>Fluxo de criação e consulta de pedidos</w:t>
+            </w:r>
+          </w:p>
+        </w:tc>
+        <w:tc>
+          <w:tcPr>
+            <w:tcW w:w="0" w:type="auto"/>
+            <w:tcBorders>
+              <w:top w:val="single" w:sz="4" w:space="0" w:color="auto"/>
+              <w:left w:val="single" w:sz="4" w:space="0" w:color="auto"/>
+              <w:bottom w:val="single" w:sz="4" w:space="0" w:color="auto"/>
+              <w:right w:val="single" w:sz="4" w:space="0" w:color="auto"/>
+            </w:tcBorders>
+            <w:vAlign w:val="center"/>
+            <w:hideMark/>
+          </w:tcPr>
+          <w:p>
+            <w:pPr>
+              <w:pStyle w:val="Cabealho"/>
+            </w:pPr>
+            <w:r>
+              <w:t>Criar, listar e consultar pedidos variando dados de entrada (mesas, itens, combinações nulas e repetidas).</w:t>
+            </w:r>
+          </w:p>
+        </w:tc>
+        <w:tc>
+          <w:tcPr>
+            <w:tcW w:w="0" w:type="auto"/>
+            <w:tcBorders>
+              <w:top w:val="single" w:sz="4" w:space="0" w:color="auto"/>
+              <w:left w:val="single" w:sz="4" w:space="0" w:color="auto"/>
+              <w:bottom w:val="single" w:sz="4" w:space="0" w:color="auto"/>
+              <w:right w:val="single" w:sz="4" w:space="0" w:color="auto"/>
+            </w:tcBorders>
+            <w:vAlign w:val="center"/>
+            <w:hideMark/>
+          </w:tcPr>
+          <w:p>
+            <w:pPr>
+              <w:pStyle w:val="Cabealho"/>
+            </w:pPr>
+            <w:r>
+              <w:t xml:space="preserve">Todos os </w:t>
+            </w:r>
+            <w:proofErr w:type="spellStart"/>
+            <w:r>
+              <w:t>endpoints</w:t>
+            </w:r>
+            <w:proofErr w:type="spellEnd"/>
+            <w:r>
+              <w:t xml:space="preserve"> devem responder com códigos e mensagens consistentes; dados devem refletir corretamente no sistema.</w:t>
+            </w:r>
+          </w:p>
+        </w:tc>
+      </w:tr>
+      <w:tr>
+        <w:trPr>
+          <w:tblCellSpacing w:w="15" w:type="dxa"/>
+        </w:trPr>
+        <w:tc>
+          <w:tcPr>
+            <w:tcW w:w="0" w:type="auto"/>
+            <w:tcBorders>
+              <w:top w:val="single" w:sz="4" w:space="0" w:color="auto"/>
+              <w:left w:val="single" w:sz="4" w:space="0" w:color="auto"/>
+              <w:bottom w:val="single" w:sz="4" w:space="0" w:color="auto"/>
+              <w:right w:val="single" w:sz="4" w:space="0" w:color="auto"/>
+            </w:tcBorders>
+            <w:vAlign w:val="center"/>
+            <w:hideMark/>
+          </w:tcPr>
+          <w:p>
+            <w:pPr>
+              <w:pStyle w:val="Cabealho"/>
+            </w:pPr>
+            <w:r>
+              <w:rPr>
+                <w:b/>
+                <w:bCs/>
+              </w:rPr>
+              <w:t>M3</w:t>
+            </w:r>
+          </w:p>
+        </w:tc>
+        <w:tc>
+          <w:tcPr>
+            <w:tcW w:w="0" w:type="auto"/>
+            <w:tcBorders>
+              <w:top w:val="single" w:sz="4" w:space="0" w:color="auto"/>
+              <w:left w:val="single" w:sz="4" w:space="0" w:color="auto"/>
+              <w:bottom w:val="single" w:sz="4" w:space="0" w:color="auto"/>
+              <w:right w:val="single" w:sz="4" w:space="0" w:color="auto"/>
+            </w:tcBorders>
+            <w:vAlign w:val="center"/>
+            <w:hideMark/>
+          </w:tcPr>
+          <w:p>
+            <w:pPr>
+              <w:pStyle w:val="Cabealho"/>
+            </w:pPr>
+            <w:r>
+              <w:rPr>
+                <w:b/>
+                <w:bCs/>
+              </w:rPr>
+              <w:t>Validação de limites e formatos</w:t>
+            </w:r>
+          </w:p>
+        </w:tc>
+        <w:tc>
+          <w:tcPr>
+            <w:tcW w:w="0" w:type="auto"/>
+            <w:tcBorders>
+              <w:top w:val="single" w:sz="4" w:space="0" w:color="auto"/>
+              <w:left w:val="single" w:sz="4" w:space="0" w:color="auto"/>
+              <w:bottom w:val="single" w:sz="4" w:space="0" w:color="auto"/>
+              <w:right w:val="single" w:sz="4" w:space="0" w:color="auto"/>
+            </w:tcBorders>
+            <w:vAlign w:val="center"/>
+            <w:hideMark/>
+          </w:tcPr>
+          <w:p>
+            <w:pPr>
+              <w:pStyle w:val="Cabealho"/>
+            </w:pPr>
+            <w:r>
+              <w:t xml:space="preserve">Enviar </w:t>
+            </w:r>
+            <w:proofErr w:type="spellStart"/>
+            <w:r>
+              <w:t>payloads</w:t>
+            </w:r>
+            <w:proofErr w:type="spellEnd"/>
+            <w:r>
+              <w:t xml:space="preserve"> com campos fora do padrão (</w:t>
+            </w:r>
+            <w:proofErr w:type="spellStart"/>
+            <w:r>
+              <w:t>ex</w:t>
+            </w:r>
+            <w:proofErr w:type="spellEnd"/>
+            <w:r>
+              <w:t>: nomes longos, JSON inválido, campos vazios).</w:t>
+            </w:r>
+          </w:p>
+        </w:tc>
+        <w:tc>
+          <w:tcPr>
+            <w:tcW w:w="0" w:type="auto"/>
+            <w:tcBorders>
+              <w:top w:val="single" w:sz="4" w:space="0" w:color="auto"/>
+              <w:left w:val="single" w:sz="4" w:space="0" w:color="auto"/>
+              <w:bottom w:val="single" w:sz="4" w:space="0" w:color="auto"/>
+              <w:right w:val="single" w:sz="4" w:space="0" w:color="auto"/>
+            </w:tcBorders>
+            <w:vAlign w:val="center"/>
+            <w:hideMark/>
+          </w:tcPr>
+          <w:p>
+            <w:pPr>
+              <w:pStyle w:val="Cabealho"/>
+            </w:pPr>
+            <w:r>
+              <w:t xml:space="preserve">A API deve rejeitar entradas inválidas com mensagem explicativa (400 </w:t>
+            </w:r>
+            <w:proofErr w:type="spellStart"/>
+            <w:r>
+              <w:t>Bad</w:t>
+            </w:r>
+            <w:proofErr w:type="spellEnd"/>
+            <w:r>
+              <w:t xml:space="preserve"> </w:t>
+            </w:r>
+            <w:proofErr w:type="spellStart"/>
+            <w:r>
+              <w:t>Request</w:t>
+            </w:r>
+            <w:proofErr w:type="spellEnd"/>
+            <w:r>
+              <w:t>).</w:t>
+            </w:r>
+          </w:p>
+        </w:tc>
+      </w:tr>
+      <w:tr>
+        <w:trPr>
+          <w:tblCellSpacing w:w="15" w:type="dxa"/>
+        </w:trPr>
+        <w:tc>
+          <w:tcPr>
+            <w:tcW w:w="0" w:type="auto"/>
+            <w:tcBorders>
+              <w:top w:val="single" w:sz="4" w:space="0" w:color="auto"/>
+              <w:left w:val="single" w:sz="4" w:space="0" w:color="auto"/>
+              <w:bottom w:val="single" w:sz="4" w:space="0" w:color="auto"/>
+              <w:right w:val="single" w:sz="4" w:space="0" w:color="auto"/>
+            </w:tcBorders>
+            <w:vAlign w:val="center"/>
+            <w:hideMark/>
+          </w:tcPr>
+          <w:p>
+            <w:pPr>
+              <w:pStyle w:val="Cabealho"/>
+            </w:pPr>
+            <w:r>
+              <w:rPr>
+                <w:b/>
+                <w:bCs/>
+              </w:rPr>
+              <w:t>M4</w:t>
+            </w:r>
+          </w:p>
+        </w:tc>
+        <w:tc>
+          <w:tcPr>
+            <w:tcW w:w="0" w:type="auto"/>
+            <w:tcBorders>
+              <w:top w:val="single" w:sz="4" w:space="0" w:color="auto"/>
+              <w:left w:val="single" w:sz="4" w:space="0" w:color="auto"/>
+              <w:bottom w:val="single" w:sz="4" w:space="0" w:color="auto"/>
+              <w:right w:val="single" w:sz="4" w:space="0" w:color="auto"/>
+            </w:tcBorders>
+            <w:vAlign w:val="center"/>
+            <w:hideMark/>
+          </w:tcPr>
+          <w:p>
+            <w:pPr>
+              <w:pStyle w:val="Cabealho"/>
+            </w:pPr>
+            <w:r>
+              <w:rPr>
+                <w:b/>
+                <w:bCs/>
+              </w:rPr>
+              <w:t>Desempenho e estabilidade</w:t>
+            </w:r>
+          </w:p>
+        </w:tc>
+        <w:tc>
+          <w:tcPr>
+            <w:tcW w:w="0" w:type="auto"/>
+            <w:tcBorders>
+              <w:top w:val="single" w:sz="4" w:space="0" w:color="auto"/>
+              <w:left w:val="single" w:sz="4" w:space="0" w:color="auto"/>
+              <w:bottom w:val="single" w:sz="4" w:space="0" w:color="auto"/>
+              <w:right w:val="single" w:sz="4" w:space="0" w:color="auto"/>
+            </w:tcBorders>
+            <w:vAlign w:val="center"/>
+            <w:hideMark/>
+          </w:tcPr>
+          <w:p>
+            <w:pPr>
+              <w:pStyle w:val="Cabealho"/>
+            </w:pPr>
+            <w:r>
+              <w:t>Observar tempos de resposta durante múltiplas requisições simultâneas e carga progressiva.</w:t>
+            </w:r>
+          </w:p>
+        </w:tc>
+        <w:tc>
+          <w:tcPr>
+            <w:tcW w:w="0" w:type="auto"/>
+            <w:tcBorders>
+              <w:top w:val="single" w:sz="4" w:space="0" w:color="auto"/>
+              <w:left w:val="single" w:sz="4" w:space="0" w:color="auto"/>
+              <w:bottom w:val="single" w:sz="4" w:space="0" w:color="auto"/>
+              <w:right w:val="single" w:sz="4" w:space="0" w:color="auto"/>
+            </w:tcBorders>
+            <w:vAlign w:val="center"/>
+            <w:hideMark/>
+          </w:tcPr>
+          <w:p>
+            <w:pPr>
+              <w:pStyle w:val="Cabealho"/>
+            </w:pPr>
+            <w:r>
+              <w:t>A API deve responder em até 3 segundos sob carga leve e se manter estável sob carga alta.</w:t>
+            </w:r>
+          </w:p>
+        </w:tc>
+      </w:tr>
+      <w:tr>
+        <w:trPr>
+          <w:tblCellSpacing w:w="15" w:type="dxa"/>
+        </w:trPr>
+        <w:tc>
+          <w:tcPr>
+            <w:tcW w:w="0" w:type="auto"/>
+            <w:tcBorders>
+              <w:top w:val="single" w:sz="4" w:space="0" w:color="auto"/>
+              <w:left w:val="single" w:sz="4" w:space="0" w:color="auto"/>
+              <w:bottom w:val="single" w:sz="4" w:space="0" w:color="auto"/>
+              <w:right w:val="single" w:sz="4" w:space="0" w:color="auto"/>
+            </w:tcBorders>
+            <w:vAlign w:val="center"/>
+            <w:hideMark/>
+          </w:tcPr>
+          <w:p>
+            <w:pPr>
+              <w:pStyle w:val="Cabealho"/>
+            </w:pPr>
+            <w:r>
+              <w:rPr>
+                <w:b/>
+                <w:bCs/>
+              </w:rPr>
+              <w:t>M5</w:t>
+            </w:r>
+          </w:p>
+        </w:tc>
+        <w:tc>
+          <w:tcPr>
+            <w:tcW w:w="0" w:type="auto"/>
+            <w:tcBorders>
+              <w:top w:val="single" w:sz="4" w:space="0" w:color="auto"/>
+              <w:left w:val="single" w:sz="4" w:space="0" w:color="auto"/>
+              <w:bottom w:val="single" w:sz="4" w:space="0" w:color="auto"/>
+              <w:right w:val="single" w:sz="4" w:space="0" w:color="auto"/>
+            </w:tcBorders>
+            <w:vAlign w:val="center"/>
+            <w:hideMark/>
+          </w:tcPr>
+          <w:p>
+            <w:pPr>
+              <w:pStyle w:val="Cabealho"/>
+            </w:pPr>
+            <w:r>
+              <w:rPr>
+                <w:b/>
+                <w:bCs/>
+              </w:rPr>
+              <w:t>Usabilidade da API (documentação e clareza)</w:t>
+            </w:r>
+          </w:p>
+        </w:tc>
+        <w:tc>
+          <w:tcPr>
+            <w:tcW w:w="0" w:type="auto"/>
+            <w:tcBorders>
+              <w:top w:val="single" w:sz="4" w:space="0" w:color="auto"/>
+              <w:left w:val="single" w:sz="4" w:space="0" w:color="auto"/>
+              <w:bottom w:val="single" w:sz="4" w:space="0" w:color="auto"/>
+              <w:right w:val="single" w:sz="4" w:space="0" w:color="auto"/>
+            </w:tcBorders>
+            <w:vAlign w:val="center"/>
+            <w:hideMark/>
+          </w:tcPr>
+          <w:p>
+            <w:pPr>
+              <w:pStyle w:val="Cabealho"/>
+            </w:pPr>
+            <w:r>
+              <w:t>Explorar o Swagger e exemplos de requisições. Avaliar clareza, completude e coerência entre documentação e comportamento real.</w:t>
+            </w:r>
+          </w:p>
+        </w:tc>
+        <w:tc>
+          <w:tcPr>
+            <w:tcW w:w="0" w:type="auto"/>
+            <w:tcBorders>
+              <w:top w:val="single" w:sz="4" w:space="0" w:color="auto"/>
+              <w:left w:val="single" w:sz="4" w:space="0" w:color="auto"/>
+              <w:bottom w:val="single" w:sz="4" w:space="0" w:color="auto"/>
+              <w:right w:val="single" w:sz="4" w:space="0" w:color="auto"/>
+            </w:tcBorders>
+            <w:vAlign w:val="center"/>
+            <w:hideMark/>
+          </w:tcPr>
+          <w:p>
+            <w:pPr>
+              <w:pStyle w:val="Cabealho"/>
+            </w:pPr>
+            <w:r>
+              <w:t>As instruções devem estar corretas e todos os exemplos devem funcionar conforme descrito.</w:t>
+            </w:r>
+          </w:p>
+        </w:tc>
+      </w:tr>
+    </w:tbl>
+    <w:p>
+      <w:pPr>
+        <w:pStyle w:val="Cabealho"/>
+      </w:pPr>
+    </w:p>
+    <w:p>
+      <w:pPr>
+        <w:pStyle w:val="Cabealho"/>
+        <w:rPr>
+          <w:b/>
+          <w:bCs/>
+        </w:rPr>
+      </w:pPr>
+      <w:r>
+        <w:rPr>
+          <w:b/>
+          <w:bCs/>
+        </w:rPr>
+        <w:t>4.6 Evidências</w:t>
+      </w:r>
+    </w:p>
+    <w:p>
+      <w:pPr>
+        <w:pStyle w:val="Cabealho"/>
+      </w:pPr>
+      <w:r>
+        <w:t>Os resultados e achados de cada missão serão documentados no relatório de teste exploratório, incluindo:</w:t>
+      </w:r>
+    </w:p>
+    <w:p>
+      <w:pPr>
+        <w:pStyle w:val="Cabealho"/>
+        <w:numPr>
+          <w:ilvl w:val="0"/>
+          <w:numId w:val="10"/>
+        </w:numPr>
+      </w:pPr>
+      <w:r>
+        <w:t>Prints de resposta (quando relevante)</w:t>
+      </w:r>
+    </w:p>
+    <w:p>
+      <w:pPr>
+        <w:pStyle w:val="Cabealho"/>
+        <w:numPr>
+          <w:ilvl w:val="0"/>
+          <w:numId w:val="10"/>
+        </w:numPr>
+      </w:pPr>
+      <w:r>
+        <w:t>Tempo médio de resposta</w:t>
+      </w:r>
+    </w:p>
+    <w:p>
+      <w:pPr>
+        <w:pStyle w:val="Cabealho"/>
+        <w:numPr>
+          <w:ilvl w:val="0"/>
+          <w:numId w:val="10"/>
+        </w:numPr>
+      </w:pPr>
+      <w:r>
+        <w:t>Logs de erro e inconsistências encontradas</w:t>
+      </w:r>
+    </w:p>
+    <w:p>
+      <w:pPr>
+        <w:pStyle w:val="Cabealho"/>
+        <w:numPr>
+          <w:ilvl w:val="0"/>
+          <w:numId w:val="10"/>
+        </w:numPr>
+      </w:pPr>
+      <w:r>
+        <w:t>Sugestões de melhoria para a API e documentação</w:t>
+      </w:r>
+    </w:p>
+    <w:p>
+      <w:pPr>
+        <w:pStyle w:val="Cabealho"/>
+      </w:pPr>
+    </w:p>
+    <w:p>
+      <w:pPr>
+        <w:pStyle w:val="Cabealho"/>
+        <w:rPr>
+          <w:b/>
+          <w:bCs/>
+        </w:rPr>
+      </w:pPr>
+    </w:p>
+    <w:p>
+      <w:pPr>
+        <w:pStyle w:val="Cabealho"/>
+        <w:rPr>
+          <w:b/>
+          <w:bCs/>
+        </w:rPr>
+      </w:pPr>
+      <w:r>
+        <w:rPr>
+          <w:b/>
+          <w:bCs/>
+        </w:rPr>
+        <w:t>5. Testes Não-Funcionais</w:t>
+      </w:r>
+    </w:p>
+    <w:p/>
+    <w:p>
+      <w:r>
+        <w:t>Definir aqui.</w:t>
+      </w:r>
+    </w:p>
+    <w:p/>
+    <w:tbl>
+      <w:tblPr>
+        <w:tblStyle w:val="TabeladeGrade1Clara"/>
+        <w:tblW w:w="0" w:type="auto"/>
+        <w:tblLook w:val="04A0" w:firstRow="1" w:lastRow="0" w:firstColumn="1" w:lastColumn="0" w:noHBand="0" w:noVBand="1"/>
+      </w:tblPr>
+      <w:tblGrid>
+        <w:gridCol w:w="2335"/>
+        <w:gridCol w:w="4320"/>
+        <w:gridCol w:w="2695"/>
+      </w:tblGrid>
+      <w:tr>
+        <w:trPr>
+          <w:cnfStyle w:val="100000000000" w:firstRow="1" w:lastRow="0" w:firstColumn="0" w:lastColumn="0" w:oddVBand="0" w:evenVBand="0" w:oddHBand="0" w:evenHBand="0" w:firstRowFirstColumn="0" w:firstRowLastColumn="0" w:lastRowFirstColumn="0" w:lastRowLastColumn="0"/>
+        </w:trPr>
+        <w:tc>
+          <w:tcPr>
+            <w:cnfStyle w:val="001000000000" w:firstRow="0" w:lastRow="0" w:firstColumn="1" w:lastColumn="0" w:oddVBand="0" w:evenVBand="0" w:oddHBand="0" w:evenHBand="0" w:firstRowFirstColumn="0" w:firstRowLastColumn="0" w:lastRowFirstColumn="0" w:lastRowLastColumn="0"/>
+            <w:tcW w:w="2335" w:type="dxa"/>
+          </w:tcPr>
+          <w:p>
+            <w:r>
+              <w:t>Tipo</w:t>
+            </w:r>
+          </w:p>
+        </w:tc>
+        <w:tc>
+          <w:tcPr>
+            <w:tcW w:w="4320" w:type="dxa"/>
+          </w:tcPr>
+          <w:p>
+            <w:pPr>
+              <w:cnfStyle w:val="100000000000" w:firstRow="1" w:lastRow="0" w:firstColumn="0" w:lastColumn="0" w:oddVBand="0" w:evenVBand="0" w:oddHBand="0" w:evenHBand="0" w:firstRowFirstColumn="0" w:firstRowLastColumn="0" w:lastRowFirstColumn="0" w:lastRowLastColumn="0"/>
+            </w:pPr>
+            <w:r>
+              <w:t>Teste</w:t>
+            </w:r>
+          </w:p>
+        </w:tc>
+        <w:tc>
+          <w:tcPr>
+            <w:tcW w:w="2695" w:type="dxa"/>
+          </w:tcPr>
+          <w:p>
+            <w:pPr>
+              <w:cnfStyle w:val="100000000000" w:firstRow="1" w:lastRow="0" w:firstColumn="0" w:lastColumn="0" w:oddVBand="0" w:evenVBand="0" w:oddHBand="0" w:evenHBand="0" w:firstRowFirstColumn="0" w:firstRowLastColumn="0" w:lastRowFirstColumn="0" w:lastRowLastColumn="0"/>
+            </w:pPr>
+            <w:r>
+              <w:t>Resultado Esperado</w:t>
+            </w:r>
+          </w:p>
+        </w:tc>
+      </w:tr>
+      <w:tr>
+        <w:tc>
+          <w:tcPr>
+            <w:cnfStyle w:val="001000000000" w:firstRow="0" w:lastRow="0" w:firstColumn="1" w:lastColumn="0" w:oddVBand="0" w:evenVBand="0" w:oddHBand="0" w:evenHBand="0" w:firstRowFirstColumn="0" w:firstRowLastColumn="0" w:lastRowFirstColumn="0" w:lastRowLastColumn="0"/>
+            <w:tcW w:w="2335" w:type="dxa"/>
+          </w:tcPr>
+          <w:p>
+            <w:pPr>
+              <w:rPr>
+                <w:b w:val="0"/>
+                <w:bCs w:val="0"/>
+              </w:rPr>
+            </w:pPr>
+            <w:r>
+              <w:rPr>
+                <w:b w:val="0"/>
+                <w:bCs w:val="0"/>
+              </w:rPr>
+              <w:t>Performance</w:t>
+            </w:r>
+          </w:p>
+        </w:tc>
+        <w:tc>
+          <w:tcPr>
+            <w:tcW w:w="4320" w:type="dxa"/>
+          </w:tcPr>
+          <w:p>
+            <w:pPr>
+              <w:cnfStyle w:val="000000000000" w:firstRow="0" w:lastRow="0" w:firstColumn="0" w:lastColumn="0" w:oddVBand="0" w:evenVBand="0" w:oddHBand="0" w:evenHBand="0" w:firstRowFirstColumn="0" w:firstRowLastColumn="0" w:lastRowFirstColumn="0" w:lastRowLastColumn="0"/>
+            </w:pPr>
+            <w:r>
+              <w:t xml:space="preserve">Testar API com 5 mil usuários simultâneos com </w:t>
+            </w:r>
+            <w:proofErr w:type="spellStart"/>
+            <w:r>
+              <w:t>ramp-up</w:t>
+            </w:r>
+            <w:proofErr w:type="spellEnd"/>
+            <w:r>
+              <w:t xml:space="preserve"> de 3 s</w:t>
+            </w:r>
+          </w:p>
+        </w:tc>
+        <w:tc>
+          <w:tcPr>
+            <w:tcW w:w="2695" w:type="dxa"/>
+          </w:tcPr>
+          <w:p>
+            <w:pPr>
+              <w:cnfStyle w:val="000000000000" w:firstRow="0" w:lastRow="0" w:firstColumn="0" w:lastColumn="0" w:oddVBand="0" w:evenVBand="0" w:oddHBand="0" w:evenHBand="0" w:firstRowFirstColumn="0" w:firstRowLastColumn="0" w:lastRowFirstColumn="0" w:lastRowLastColumn="0"/>
+            </w:pPr>
+            <w:r>
+              <w:t xml:space="preserve">Responder em até </w:t>
+            </w:r>
+            <w:r>
+              <w:rPr>
+                <w:b/>
+                <w:bCs/>
+              </w:rPr>
+              <w:t>3 segundos</w:t>
+            </w:r>
+            <w:r>
+              <w:t>, sem erros de timeout ou queda de serviço</w:t>
+            </w:r>
+          </w:p>
+        </w:tc>
+      </w:tr>
+      <w:tr>
+        <w:tc>
+          <w:tcPr>
+            <w:cnfStyle w:val="001000000000" w:firstRow="0" w:lastRow="0" w:firstColumn="1" w:lastColumn="0" w:oddVBand="0" w:evenVBand="0" w:oddHBand="0" w:evenHBand="0" w:firstRowFirstColumn="0" w:firstRowLastColumn="0" w:lastRowFirstColumn="0" w:lastRowLastColumn="0"/>
+            <w:tcW w:w="2335" w:type="dxa"/>
+          </w:tcPr>
+          <w:p>
+            <w:pPr>
+              <w:rPr>
+                <w:b w:val="0"/>
+                <w:bCs w:val="0"/>
+              </w:rPr>
+            </w:pPr>
+            <w:r>
+              <w:rPr>
+                <w:b w:val="0"/>
+                <w:bCs w:val="0"/>
+              </w:rPr>
+              <w:lastRenderedPageBreak/>
+              <w:t>Acessibilidade</w:t>
+            </w:r>
+          </w:p>
+        </w:tc>
+        <w:tc>
+          <w:tcPr>
+            <w:tcW w:w="4320" w:type="dxa"/>
+          </w:tcPr>
+          <w:p>
+            <w:pPr>
+              <w:cnfStyle w:val="000000000000" w:firstRow="0" w:lastRow="0" w:firstColumn="0" w:lastColumn="0" w:oddVBand="0" w:evenVBand="0" w:oddHBand="0" w:evenHBand="0" w:firstRowFirstColumn="0" w:firstRowLastColumn="0" w:lastRowFirstColumn="0" w:lastRowLastColumn="0"/>
+            </w:pPr>
+            <w:r>
+              <w:t>Validar se a documentação Swagger é acessível (navegável via teclado e leitores de tela)</w:t>
+            </w:r>
+          </w:p>
+        </w:tc>
+        <w:tc>
+          <w:tcPr>
+            <w:tcW w:w="2695" w:type="dxa"/>
+          </w:tcPr>
+          <w:p>
+            <w:pPr>
+              <w:cnfStyle w:val="000000000000" w:firstRow="0" w:lastRow="0" w:firstColumn="0" w:lastColumn="0" w:oddVBand="0" w:evenVBand="0" w:oddHBand="0" w:evenHBand="0" w:firstRowFirstColumn="0" w:firstRowLastColumn="0" w:lastRowFirstColumn="0" w:lastRowLastColumn="0"/>
+            </w:pPr>
+            <w:r>
+              <w:t>Todos os elementos da interface devem ser acessíveis via teclado e compatíveis com leitores de tela (WCAG 2.1 nível AA)</w:t>
+            </w:r>
+          </w:p>
+        </w:tc>
+      </w:tr>
+      <w:tr>
+        <w:tc>
+          <w:tcPr>
+            <w:cnfStyle w:val="001000000000" w:firstRow="0" w:lastRow="0" w:firstColumn="1" w:lastColumn="0" w:oddVBand="0" w:evenVBand="0" w:oddHBand="0" w:evenHBand="0" w:firstRowFirstColumn="0" w:firstRowLastColumn="0" w:lastRowFirstColumn="0" w:lastRowLastColumn="0"/>
+            <w:tcW w:w="2335" w:type="dxa"/>
+          </w:tcPr>
+          <w:p>
+            <w:pPr>
+              <w:rPr>
+                <w:b w:val="0"/>
+                <w:bCs w:val="0"/>
+              </w:rPr>
+            </w:pPr>
+            <w:r>
+              <w:rPr>
+                <w:b w:val="0"/>
+                <w:bCs w:val="0"/>
+              </w:rPr>
+              <w:t>Usabilidade</w:t>
+            </w:r>
+          </w:p>
+        </w:tc>
+        <w:tc>
+          <w:tcPr>
+            <w:tcW w:w="4320" w:type="dxa"/>
+          </w:tcPr>
+          <w:p>
+            <w:pPr>
+              <w:cnfStyle w:val="000000000000" w:firstRow="0" w:lastRow="0" w:firstColumn="0" w:lastColumn="0" w:oddVBand="0" w:evenVBand="0" w:oddHBand="0" w:evenHBand="0" w:firstRowFirstColumn="0" w:firstRowLastColumn="0" w:lastRowFirstColumn="0" w:lastRowLastColumn="0"/>
+            </w:pPr>
+            <w:r>
+              <w:t>Verificar clareza e consistência das mensagens de erro da API (</w:t>
+            </w:r>
+            <w:proofErr w:type="spellStart"/>
+            <w:r>
+              <w:t>ex</w:t>
+            </w:r>
+            <w:proofErr w:type="spellEnd"/>
+            <w:r>
+              <w:t>: códigos HTTP e corpo de resposta)</w:t>
+            </w:r>
+          </w:p>
+        </w:tc>
+        <w:tc>
+          <w:tcPr>
+            <w:tcW w:w="2695" w:type="dxa"/>
+          </w:tcPr>
+          <w:p>
+            <w:pPr>
+              <w:cnfStyle w:val="000000000000" w:firstRow="0" w:lastRow="0" w:firstColumn="0" w:lastColumn="0" w:oddVBand="0" w:evenVBand="0" w:oddHBand="0" w:evenHBand="0" w:firstRowFirstColumn="0" w:firstRowLastColumn="0" w:lastRowFirstColumn="0" w:lastRowLastColumn="0"/>
+            </w:pPr>
+            <w:r>
+              <w:t>Mensagens de erro padronizadas, com explicação clara do motivo (</w:t>
+            </w:r>
+            <w:proofErr w:type="spellStart"/>
+            <w:r>
+              <w:t>ex</w:t>
+            </w:r>
+            <w:proofErr w:type="spellEnd"/>
+            <w:r>
+              <w:t>: “Token inválido” em vez de genérico “Erro 500”)</w:t>
+            </w:r>
+          </w:p>
+        </w:tc>
+      </w:tr>
+    </w:tbl>
+    <w:p>
+      <w:pPr>
+        <w:pStyle w:val="Cabealho"/>
+        <w:rPr>
+          <w:b/>
+          <w:bCs/>
+        </w:rPr>
+      </w:pPr>
+    </w:p>
+    <w:p>
+      <w:pPr>
+        <w:rPr>
+          <w:b/>
+          <w:bCs/>
+        </w:rPr>
+      </w:pPr>
+      <w:r>
+        <w:rPr>
+          <w:b/>
+          <w:bCs/>
+        </w:rPr>
+        <w:br w:type="page"/>
+      </w:r>
+    </w:p>
+    <w:p>
+      <w:pPr>
+        <w:pStyle w:val="Cabealho"/>
+        <w:rPr>
+          <w:b/>
+          <w:bCs/>
+        </w:rPr>
+      </w:pPr>
+      <w:r>
+        <w:rPr>
+          <w:b/>
+          <w:bCs/>
+        </w:rPr>
+        <w:lastRenderedPageBreak/>
+        <w:t>6. Automação de Testes</w:t>
+      </w:r>
+    </w:p>
+    <w:p/>
+    <w:p>
+      <w:r>
+        <w:t>Definir aqui.</w:t>
+      </w:r>
+    </w:p>
+    <w:p/>
+    <w:tbl>
+      <w:tblPr>
+        <w:tblStyle w:val="TabeladeGrade1Clara"/>
+        <w:tblW w:w="0" w:type="auto"/>
+        <w:tblLook w:val="04A0" w:firstRow="1" w:lastRow="0" w:firstColumn="1" w:lastColumn="0" w:noHBand="0" w:noVBand="1"/>
+      </w:tblPr>
+      <w:tblGrid>
+        <w:gridCol w:w="895"/>
+        <w:gridCol w:w="3796"/>
+        <w:gridCol w:w="2438"/>
+        <w:gridCol w:w="2221"/>
+      </w:tblGrid>
+      <w:tr>
+        <w:trPr>
+          <w:cnfStyle w:val="100000000000" w:firstRow="1" w:lastRow="0" w:firstColumn="0" w:lastColumn="0" w:oddVBand="0" w:evenVBand="0" w:oddHBand="0" w:evenHBand="0" w:firstRowFirstColumn="0" w:firstRowLastColumn="0" w:lastRowFirstColumn="0" w:lastRowLastColumn="0"/>
+        </w:trPr>
+        <w:tc>
+          <w:tcPr>
+            <w:cnfStyle w:val="001000000000" w:firstRow="0" w:lastRow="0" w:firstColumn="1" w:lastColumn="0" w:oddVBand="0" w:evenVBand="0" w:oddHBand="0" w:evenHBand="0" w:firstRowFirstColumn="0" w:firstRowLastColumn="0" w:lastRowFirstColumn="0" w:lastRowLastColumn="0"/>
+            <w:tcW w:w="895" w:type="dxa"/>
+          </w:tcPr>
+          <w:p>
+            <w:r>
+              <w:t>ID</w:t>
+            </w:r>
+          </w:p>
+        </w:tc>
+        <w:tc>
+          <w:tcPr>
+            <w:tcW w:w="3796" w:type="dxa"/>
+          </w:tcPr>
+          <w:p>
+            <w:pPr>
+              <w:cnfStyle w:val="100000000000" w:firstRow="1" w:lastRow="0" w:firstColumn="0" w:lastColumn="0" w:oddVBand="0" w:evenVBand="0" w:oddHBand="0" w:evenHBand="0" w:firstRowFirstColumn="0" w:firstRowLastColumn="0" w:lastRowFirstColumn="0" w:lastRowLastColumn="0"/>
+            </w:pPr>
+            <w:r>
+              <w:t>Condição</w:t>
+            </w:r>
+          </w:p>
+        </w:tc>
+        <w:tc>
+          <w:tcPr>
+            <w:tcW w:w="2438" w:type="dxa"/>
+          </w:tcPr>
+          <w:p>
+            <w:pPr>
+              <w:cnfStyle w:val="100000000000" w:firstRow="1" w:lastRow="0" w:firstColumn="0" w:lastColumn="0" w:oddVBand="0" w:evenVBand="0" w:oddHBand="0" w:evenHBand="0" w:firstRowFirstColumn="0" w:firstRowLastColumn="0" w:lastRowFirstColumn="0" w:lastRowLastColumn="0"/>
+            </w:pPr>
+            <w:r>
+              <w:t>Resultado Esperado</w:t>
+            </w:r>
+          </w:p>
+        </w:tc>
+        <w:tc>
+          <w:tcPr>
+            <w:tcW w:w="2221" w:type="dxa"/>
+          </w:tcPr>
+          <w:p>
+            <w:pPr>
+              <w:cnfStyle w:val="100000000000" w:firstRow="1" w:lastRow="0" w:firstColumn="0" w:lastColumn="0" w:oddVBand="0" w:evenVBand="0" w:oddHBand="0" w:evenHBand="0" w:firstRowFirstColumn="0" w:firstRowLastColumn="0" w:lastRowFirstColumn="0" w:lastRowLastColumn="0"/>
+            </w:pPr>
+            <w:r>
+              <w:t>Camada</w:t>
+            </w:r>
+          </w:p>
+        </w:tc>
+      </w:tr>
+      <w:tr>
+        <w:tc>
+          <w:tcPr>
+            <w:cnfStyle w:val="001000000000" w:firstRow="0" w:lastRow="0" w:firstColumn="1" w:lastColumn="0" w:oddVBand="0" w:evenVBand="0" w:oddHBand="0" w:evenHBand="0" w:firstRowFirstColumn="0" w:firstRowLastColumn="0" w:lastRowFirstColumn="0" w:lastRowLastColumn="0"/>
+            <w:tcW w:w="895" w:type="dxa"/>
+          </w:tcPr>
           <w:p/>
         </w:tc>
         <w:tc>
@@ -1955,6 +3992,155 @@
 <file path=word/numbering.xml><?xml version="1.0" encoding="utf-8"?>
 <w:numbering xmlns:wpc="http://schemas.microsoft.com/office/word/2010/wordprocessingCanvas" xmlns:cx="http://schemas.microsoft.com/office/drawing/2014/chartex" xmlns:cx1="http://schemas.microsoft.com/office/drawing/2015/9/8/chartex" xmlns:cx2="http://schemas.microsoft.com/office/drawing/2015/10/21/chartex" xmlns:cx3="http://schemas.microsoft.com/office/drawing/2016/5/9/chartex" xmlns:cx4="http://schemas.microsoft.com/office/drawing/2016/5/10/chartex" xmlns:cx5="http://schemas.microsoft.com/office/drawing/2016/5/11/chartex" xmlns:cx6="http://schemas.microsoft.com/office/drawing/2016/5/12/chartex" xmlns:cx7="http://schemas.microsoft.com/office/drawing/2016/5/13/chartex" xmlns:cx8="http://schemas.microsoft.com/office/drawing/2016/5/14/chartex" xmlns:mc="http://schemas.openxmlformats.org/markup-compatibility/2006" xmlns:aink="http://schemas.microsoft.com/office/drawing/2016/ink" xmlns:am3d="http://schemas.microsoft.com/office/drawing/2017/model3d" xmlns:o="urn:schemas-microsoft-com:office:office" xmlns:oel="http://schemas.microsoft.com/office/2019/extlst" xmlns:r="http://schemas.openxmlformats.org/officeDocument/2006/relationships" xmlns:m="http://schemas.openxmlformats.org/officeDocument/2006/math" xmlns:v="urn:schemas-microsoft-com:vml" xmlns:wp14="http://schemas.microsoft.com/office/word/2010/wordprocessingDrawing" xmlns:wp="http://schemas.openxmlformats.org/drawingml/2006/wordprocessingDrawing" xmlns:w10="urn:schemas-microsoft-com:office:word" xmlns:w="http://schemas.openxmlformats.org/wordprocessingml/2006/main" xmlns:w14="http://schemas.microsoft.com/office/word/2010/wordml" xmlns:w15="http://schemas.microsoft.com/office/word/2012/wordml" xmlns:w16cex="http://schemas.microsoft.com/office/word/2018/wordml/cex" xmlns:w16cid="http://schemas.microsoft.com/office/word/2016/wordml/cid" xmlns:w16="http://schemas.microsoft.com/office/word/2018/wordml" xmlns:w16du="http://schemas.microsoft.com/office/word/2023/wordml/word16du" xmlns:w16sdtdh="http://schemas.microsoft.com/office/word/2020/wordml/sdtdatahash" xmlns:w16sdtfl="http://schemas.microsoft.com/office/word/2024/wordml/sdtformatlock" xmlns:w16se="http://schemas.microsoft.com/office/word/2015/wordml/symex" xmlns:wpg="http://schemas.microsoft.com/office/word/2010/wordprocessingGroup" xmlns:wpi="http://schemas.microsoft.com/office/word/2010/wordprocessingInk" xmlns:wne="http://schemas.microsoft.com/office/word/2006/wordml" xmlns:wps="http://schemas.microsoft.com/office/word/2010/wordprocessingShape" mc:Ignorable="w14 w15 w16se w16cid w16 w16cex w16sdtdh w16sdtfl w16du wp14">
   <w:abstractNum w:abstractNumId="0" w15:restartNumberingAfterBreak="0">
+    <w:nsid w:val="0C857CA1"/>
+    <w:multiLevelType w:val="multilevel"/>
+    <w:tmpl w:val="F342EBB4"/>
+    <w:lvl w:ilvl="0">
+      <w:start w:val="1"/>
+      <w:numFmt w:val="bullet"/>
+      <w:lvlText w:val=""/>
+      <w:lvlJc w:val="left"/>
+      <w:pPr>
+        <w:tabs>
+          <w:tab w:val="num" w:pos="720"/>
+        </w:tabs>
+        <w:ind w:left="720" w:hanging="360"/>
+      </w:pPr>
+      <w:rPr>
+        <w:rFonts w:ascii="Symbol" w:hAnsi="Symbol" w:hint="default"/>
+        <w:sz w:val="20"/>
+      </w:rPr>
+    </w:lvl>
+    <w:lvl w:ilvl="1" w:tentative="1">
+      <w:start w:val="1"/>
+      <w:numFmt w:val="bullet"/>
+      <w:lvlText w:val="o"/>
+      <w:lvlJc w:val="left"/>
+      <w:pPr>
+        <w:tabs>
+          <w:tab w:val="num" w:pos="1440"/>
+        </w:tabs>
+        <w:ind w:left="1440" w:hanging="360"/>
+      </w:pPr>
+      <w:rPr>
+        <w:rFonts w:ascii="Courier New" w:hAnsi="Courier New" w:hint="default"/>
+        <w:sz w:val="20"/>
+      </w:rPr>
+    </w:lvl>
+    <w:lvl w:ilvl="2" w:tentative="1">
+      <w:start w:val="1"/>
+      <w:numFmt w:val="bullet"/>
+      <w:lvlText w:val=""/>
+      <w:lvlJc w:val="left"/>
+      <w:pPr>
+        <w:tabs>
+          <w:tab w:val="num" w:pos="2160"/>
+        </w:tabs>
+        <w:ind w:left="2160" w:hanging="360"/>
+      </w:pPr>
+      <w:rPr>
+        <w:rFonts w:ascii="Wingdings" w:hAnsi="Wingdings" w:hint="default"/>
+        <w:sz w:val="20"/>
+      </w:rPr>
+    </w:lvl>
+    <w:lvl w:ilvl="3" w:tentative="1">
+      <w:start w:val="1"/>
+      <w:numFmt w:val="bullet"/>
+      <w:lvlText w:val=""/>
+      <w:lvlJc w:val="left"/>
+      <w:pPr>
+        <w:tabs>
+          <w:tab w:val="num" w:pos="2880"/>
+        </w:tabs>
+        <w:ind w:left="2880" w:hanging="360"/>
+      </w:pPr>
+      <w:rPr>
+        <w:rFonts w:ascii="Wingdings" w:hAnsi="Wingdings" w:hint="default"/>
+        <w:sz w:val="20"/>
+      </w:rPr>
+    </w:lvl>
+    <w:lvl w:ilvl="4" w:tentative="1">
+      <w:start w:val="1"/>
+      <w:numFmt w:val="bullet"/>
+      <w:lvlText w:val=""/>
+      <w:lvlJc w:val="left"/>
+      <w:pPr>
+        <w:tabs>
+          <w:tab w:val="num" w:pos="3600"/>
+        </w:tabs>
+        <w:ind w:left="3600" w:hanging="360"/>
+      </w:pPr>
+      <w:rPr>
+        <w:rFonts w:ascii="Wingdings" w:hAnsi="Wingdings" w:hint="default"/>
+        <w:sz w:val="20"/>
+      </w:rPr>
+    </w:lvl>
+    <w:lvl w:ilvl="5" w:tentative="1">
+      <w:start w:val="1"/>
+      <w:numFmt w:val="bullet"/>
+      <w:lvlText w:val=""/>
+      <w:lvlJc w:val="left"/>
+      <w:pPr>
+        <w:tabs>
+          <w:tab w:val="num" w:pos="4320"/>
+        </w:tabs>
+        <w:ind w:left="4320" w:hanging="360"/>
+      </w:pPr>
+      <w:rPr>
+        <w:rFonts w:ascii="Wingdings" w:hAnsi="Wingdings" w:hint="default"/>
+        <w:sz w:val="20"/>
+      </w:rPr>
+    </w:lvl>
+    <w:lvl w:ilvl="6" w:tentative="1">
+      <w:start w:val="1"/>
+      <w:numFmt w:val="bullet"/>
+      <w:lvlText w:val=""/>
+      <w:lvlJc w:val="left"/>
+      <w:pPr>
+        <w:tabs>
+          <w:tab w:val="num" w:pos="5040"/>
+        </w:tabs>
+        <w:ind w:left="5040" w:hanging="360"/>
+      </w:pPr>
+      <w:rPr>
+        <w:rFonts w:ascii="Wingdings" w:hAnsi="Wingdings" w:hint="default"/>
+        <w:sz w:val="20"/>
+      </w:rPr>
+    </w:lvl>
+    <w:lvl w:ilvl="7" w:tentative="1">
+      <w:start w:val="1"/>
+      <w:numFmt w:val="bullet"/>
+      <w:lvlText w:val=""/>
+      <w:lvlJc w:val="left"/>
+      <w:pPr>
+        <w:tabs>
+          <w:tab w:val="num" w:pos="5760"/>
+        </w:tabs>
+        <w:ind w:left="5760" w:hanging="360"/>
+      </w:pPr>
+      <w:rPr>
+        <w:rFonts w:ascii="Wingdings" w:hAnsi="Wingdings" w:hint="default"/>
+        <w:sz w:val="20"/>
+      </w:rPr>
+    </w:lvl>
+    <w:lvl w:ilvl="8" w:tentative="1">
+      <w:start w:val="1"/>
+      <w:numFmt w:val="bullet"/>
+      <w:lvlText w:val=""/>
+      <w:lvlJc w:val="left"/>
+      <w:pPr>
+        <w:tabs>
+          <w:tab w:val="num" w:pos="6480"/>
+        </w:tabs>
+        <w:ind w:left="6480" w:hanging="360"/>
+      </w:pPr>
+      <w:rPr>
+        <w:rFonts w:ascii="Wingdings" w:hAnsi="Wingdings" w:hint="default"/>
+        <w:sz w:val="20"/>
+      </w:rPr>
+    </w:lvl>
+  </w:abstractNum>
+  <w:abstractNum w:abstractNumId="1" w15:restartNumberingAfterBreak="0">
     <w:nsid w:val="13ED3201"/>
     <w:multiLevelType w:val="hybridMultilevel"/>
     <w:tmpl w:val="0FC42B68"/>
@@ -2067,7 +4253,7 @@
       </w:rPr>
     </w:lvl>
   </w:abstractNum>
-  <w:abstractNum w:abstractNumId="1" w15:restartNumberingAfterBreak="0">
+  <w:abstractNum w:abstractNumId="2" w15:restartNumberingAfterBreak="0">
     <w:nsid w:val="16585F53"/>
     <w:multiLevelType w:val="hybridMultilevel"/>
     <w:tmpl w:val="495838B8"/>
@@ -2180,7 +4366,7 @@
       </w:rPr>
     </w:lvl>
   </w:abstractNum>
-  <w:abstractNum w:abstractNumId="2" w15:restartNumberingAfterBreak="0">
+  <w:abstractNum w:abstractNumId="3" w15:restartNumberingAfterBreak="0">
     <w:nsid w:val="33864EF2"/>
     <w:multiLevelType w:val="hybridMultilevel"/>
     <w:tmpl w:val="D08410F6"/>
@@ -2293,7 +4479,7 @@
       </w:rPr>
     </w:lvl>
   </w:abstractNum>
-  <w:abstractNum w:abstractNumId="3" w15:restartNumberingAfterBreak="0">
+  <w:abstractNum w:abstractNumId="4" w15:restartNumberingAfterBreak="0">
     <w:nsid w:val="45964E46"/>
     <w:multiLevelType w:val="hybridMultilevel"/>
     <w:tmpl w:val="1EFE54F6"/>
@@ -2406,7 +4592,454 @@
       </w:rPr>
     </w:lvl>
   </w:abstractNum>
-  <w:abstractNum w:abstractNumId="4" w15:restartNumberingAfterBreak="0">
+  <w:abstractNum w:abstractNumId="5" w15:restartNumberingAfterBreak="0">
+    <w:nsid w:val="4BA36E8C"/>
+    <w:multiLevelType w:val="multilevel"/>
+    <w:tmpl w:val="5C9C5F54"/>
+    <w:lvl w:ilvl="0">
+      <w:start w:val="1"/>
+      <w:numFmt w:val="bullet"/>
+      <w:lvlText w:val=""/>
+      <w:lvlJc w:val="left"/>
+      <w:pPr>
+        <w:tabs>
+          <w:tab w:val="num" w:pos="720"/>
+        </w:tabs>
+        <w:ind w:left="720" w:hanging="360"/>
+      </w:pPr>
+      <w:rPr>
+        <w:rFonts w:ascii="Symbol" w:hAnsi="Symbol" w:hint="default"/>
+        <w:sz w:val="20"/>
+      </w:rPr>
+    </w:lvl>
+    <w:lvl w:ilvl="1" w:tentative="1">
+      <w:start w:val="1"/>
+      <w:numFmt w:val="bullet"/>
+      <w:lvlText w:val="o"/>
+      <w:lvlJc w:val="left"/>
+      <w:pPr>
+        <w:tabs>
+          <w:tab w:val="num" w:pos="1440"/>
+        </w:tabs>
+        <w:ind w:left="1440" w:hanging="360"/>
+      </w:pPr>
+      <w:rPr>
+        <w:rFonts w:ascii="Courier New" w:hAnsi="Courier New" w:hint="default"/>
+        <w:sz w:val="20"/>
+      </w:rPr>
+    </w:lvl>
+    <w:lvl w:ilvl="2" w:tentative="1">
+      <w:start w:val="1"/>
+      <w:numFmt w:val="bullet"/>
+      <w:lvlText w:val=""/>
+      <w:lvlJc w:val="left"/>
+      <w:pPr>
+        <w:tabs>
+          <w:tab w:val="num" w:pos="2160"/>
+        </w:tabs>
+        <w:ind w:left="2160" w:hanging="360"/>
+      </w:pPr>
+      <w:rPr>
+        <w:rFonts w:ascii="Wingdings" w:hAnsi="Wingdings" w:hint="default"/>
+        <w:sz w:val="20"/>
+      </w:rPr>
+    </w:lvl>
+    <w:lvl w:ilvl="3" w:tentative="1">
+      <w:start w:val="1"/>
+      <w:numFmt w:val="bullet"/>
+      <w:lvlText w:val=""/>
+      <w:lvlJc w:val="left"/>
+      <w:pPr>
+        <w:tabs>
+          <w:tab w:val="num" w:pos="2880"/>
+        </w:tabs>
+        <w:ind w:left="2880" w:hanging="360"/>
+      </w:pPr>
+      <w:rPr>
+        <w:rFonts w:ascii="Wingdings" w:hAnsi="Wingdings" w:hint="default"/>
+        <w:sz w:val="20"/>
+      </w:rPr>
+    </w:lvl>
+    <w:lvl w:ilvl="4" w:tentative="1">
+      <w:start w:val="1"/>
+      <w:numFmt w:val="bullet"/>
+      <w:lvlText w:val=""/>
+      <w:lvlJc w:val="left"/>
+      <w:pPr>
+        <w:tabs>
+          <w:tab w:val="num" w:pos="3600"/>
+        </w:tabs>
+        <w:ind w:left="3600" w:hanging="360"/>
+      </w:pPr>
+      <w:rPr>
+        <w:rFonts w:ascii="Wingdings" w:hAnsi="Wingdings" w:hint="default"/>
+        <w:sz w:val="20"/>
+      </w:rPr>
+    </w:lvl>
+    <w:lvl w:ilvl="5" w:tentative="1">
+      <w:start w:val="1"/>
+      <w:numFmt w:val="bullet"/>
+      <w:lvlText w:val=""/>
+      <w:lvlJc w:val="left"/>
+      <w:pPr>
+        <w:tabs>
+          <w:tab w:val="num" w:pos="4320"/>
+        </w:tabs>
+        <w:ind w:left="4320" w:hanging="360"/>
+      </w:pPr>
+      <w:rPr>
+        <w:rFonts w:ascii="Wingdings" w:hAnsi="Wingdings" w:hint="default"/>
+        <w:sz w:val="20"/>
+      </w:rPr>
+    </w:lvl>
+    <w:lvl w:ilvl="6" w:tentative="1">
+      <w:start w:val="1"/>
+      <w:numFmt w:val="bullet"/>
+      <w:lvlText w:val=""/>
+      <w:lvlJc w:val="left"/>
+      <w:pPr>
+        <w:tabs>
+          <w:tab w:val="num" w:pos="5040"/>
+        </w:tabs>
+        <w:ind w:left="5040" w:hanging="360"/>
+      </w:pPr>
+      <w:rPr>
+        <w:rFonts w:ascii="Wingdings" w:hAnsi="Wingdings" w:hint="default"/>
+        <w:sz w:val="20"/>
+      </w:rPr>
+    </w:lvl>
+    <w:lvl w:ilvl="7" w:tentative="1">
+      <w:start w:val="1"/>
+      <w:numFmt w:val="bullet"/>
+      <w:lvlText w:val=""/>
+      <w:lvlJc w:val="left"/>
+      <w:pPr>
+        <w:tabs>
+          <w:tab w:val="num" w:pos="5760"/>
+        </w:tabs>
+        <w:ind w:left="5760" w:hanging="360"/>
+      </w:pPr>
+      <w:rPr>
+        <w:rFonts w:ascii="Wingdings" w:hAnsi="Wingdings" w:hint="default"/>
+        <w:sz w:val="20"/>
+      </w:rPr>
+    </w:lvl>
+    <w:lvl w:ilvl="8" w:tentative="1">
+      <w:start w:val="1"/>
+      <w:numFmt w:val="bullet"/>
+      <w:lvlText w:val=""/>
+      <w:lvlJc w:val="left"/>
+      <w:pPr>
+        <w:tabs>
+          <w:tab w:val="num" w:pos="6480"/>
+        </w:tabs>
+        <w:ind w:left="6480" w:hanging="360"/>
+      </w:pPr>
+      <w:rPr>
+        <w:rFonts w:ascii="Wingdings" w:hAnsi="Wingdings" w:hint="default"/>
+        <w:sz w:val="20"/>
+      </w:rPr>
+    </w:lvl>
+  </w:abstractNum>
+  <w:abstractNum w:abstractNumId="6" w15:restartNumberingAfterBreak="0">
+    <w:nsid w:val="52B66549"/>
+    <w:multiLevelType w:val="multilevel"/>
+    <w:tmpl w:val="C758FD6A"/>
+    <w:lvl w:ilvl="0">
+      <w:start w:val="1"/>
+      <w:numFmt w:val="bullet"/>
+      <w:lvlText w:val=""/>
+      <w:lvlJc w:val="left"/>
+      <w:pPr>
+        <w:tabs>
+          <w:tab w:val="num" w:pos="720"/>
+        </w:tabs>
+        <w:ind w:left="720" w:hanging="360"/>
+      </w:pPr>
+      <w:rPr>
+        <w:rFonts w:ascii="Symbol" w:hAnsi="Symbol" w:hint="default"/>
+        <w:sz w:val="20"/>
+      </w:rPr>
+    </w:lvl>
+    <w:lvl w:ilvl="1">
+      <w:start w:val="1"/>
+      <w:numFmt w:val="bullet"/>
+      <w:lvlText w:val="o"/>
+      <w:lvlJc w:val="left"/>
+      <w:pPr>
+        <w:tabs>
+          <w:tab w:val="num" w:pos="1440"/>
+        </w:tabs>
+        <w:ind w:left="1440" w:hanging="360"/>
+      </w:pPr>
+      <w:rPr>
+        <w:rFonts w:ascii="Courier New" w:hAnsi="Courier New" w:hint="default"/>
+        <w:sz w:val="20"/>
+      </w:rPr>
+    </w:lvl>
+    <w:lvl w:ilvl="2" w:tentative="1">
+      <w:start w:val="1"/>
+      <w:numFmt w:val="bullet"/>
+      <w:lvlText w:val=""/>
+      <w:lvlJc w:val="left"/>
+      <w:pPr>
+        <w:tabs>
+          <w:tab w:val="num" w:pos="2160"/>
+        </w:tabs>
+        <w:ind w:left="2160" w:hanging="360"/>
+      </w:pPr>
+      <w:rPr>
+        <w:rFonts w:ascii="Wingdings" w:hAnsi="Wingdings" w:hint="default"/>
+        <w:sz w:val="20"/>
+      </w:rPr>
+    </w:lvl>
+    <w:lvl w:ilvl="3" w:tentative="1">
+      <w:start w:val="1"/>
+      <w:numFmt w:val="bullet"/>
+      <w:lvlText w:val=""/>
+      <w:lvlJc w:val="left"/>
+      <w:pPr>
+        <w:tabs>
+          <w:tab w:val="num" w:pos="2880"/>
+        </w:tabs>
+        <w:ind w:left="2880" w:hanging="360"/>
+      </w:pPr>
+      <w:rPr>
+        <w:rFonts w:ascii="Wingdings" w:hAnsi="Wingdings" w:hint="default"/>
+        <w:sz w:val="20"/>
+      </w:rPr>
+    </w:lvl>
+    <w:lvl w:ilvl="4" w:tentative="1">
+      <w:start w:val="1"/>
+      <w:numFmt w:val="bullet"/>
+      <w:lvlText w:val=""/>
+      <w:lvlJc w:val="left"/>
+      <w:pPr>
+        <w:tabs>
+          <w:tab w:val="num" w:pos="3600"/>
+        </w:tabs>
+        <w:ind w:left="3600" w:hanging="360"/>
+      </w:pPr>
+      <w:rPr>
+        <w:rFonts w:ascii="Wingdings" w:hAnsi="Wingdings" w:hint="default"/>
+        <w:sz w:val="20"/>
+      </w:rPr>
+    </w:lvl>
+    <w:lvl w:ilvl="5" w:tentative="1">
+      <w:start w:val="1"/>
+      <w:numFmt w:val="bullet"/>
+      <w:lvlText w:val=""/>
+      <w:lvlJc w:val="left"/>
+      <w:pPr>
+        <w:tabs>
+          <w:tab w:val="num" w:pos="4320"/>
+        </w:tabs>
+        <w:ind w:left="4320" w:hanging="360"/>
+      </w:pPr>
+      <w:rPr>
+        <w:rFonts w:ascii="Wingdings" w:hAnsi="Wingdings" w:hint="default"/>
+        <w:sz w:val="20"/>
+      </w:rPr>
+    </w:lvl>
+    <w:lvl w:ilvl="6" w:tentative="1">
+      <w:start w:val="1"/>
+      <w:numFmt w:val="bullet"/>
+      <w:lvlText w:val=""/>
+      <w:lvlJc w:val="left"/>
+      <w:pPr>
+        <w:tabs>
+          <w:tab w:val="num" w:pos="5040"/>
+        </w:tabs>
+        <w:ind w:left="5040" w:hanging="360"/>
+      </w:pPr>
+      <w:rPr>
+        <w:rFonts w:ascii="Wingdings" w:hAnsi="Wingdings" w:hint="default"/>
+        <w:sz w:val="20"/>
+      </w:rPr>
+    </w:lvl>
+    <w:lvl w:ilvl="7" w:tentative="1">
+      <w:start w:val="1"/>
+      <w:numFmt w:val="bullet"/>
+      <w:lvlText w:val=""/>
+      <w:lvlJc w:val="left"/>
+      <w:pPr>
+        <w:tabs>
+          <w:tab w:val="num" w:pos="5760"/>
+        </w:tabs>
+        <w:ind w:left="5760" w:hanging="360"/>
+      </w:pPr>
+      <w:rPr>
+        <w:rFonts w:ascii="Wingdings" w:hAnsi="Wingdings" w:hint="default"/>
+        <w:sz w:val="20"/>
+      </w:rPr>
+    </w:lvl>
+    <w:lvl w:ilvl="8" w:tentative="1">
+      <w:start w:val="1"/>
+      <w:numFmt w:val="bullet"/>
+      <w:lvlText w:val=""/>
+      <w:lvlJc w:val="left"/>
+      <w:pPr>
+        <w:tabs>
+          <w:tab w:val="num" w:pos="6480"/>
+        </w:tabs>
+        <w:ind w:left="6480" w:hanging="360"/>
+      </w:pPr>
+      <w:rPr>
+        <w:rFonts w:ascii="Wingdings" w:hAnsi="Wingdings" w:hint="default"/>
+        <w:sz w:val="20"/>
+      </w:rPr>
+    </w:lvl>
+  </w:abstractNum>
+  <w:abstractNum w:abstractNumId="7" w15:restartNumberingAfterBreak="0">
+    <w:nsid w:val="60D353FC"/>
+    <w:multiLevelType w:val="multilevel"/>
+    <w:tmpl w:val="5B08D558"/>
+    <w:lvl w:ilvl="0">
+      <w:start w:val="1"/>
+      <w:numFmt w:val="bullet"/>
+      <w:lvlText w:val=""/>
+      <w:lvlJc w:val="left"/>
+      <w:pPr>
+        <w:tabs>
+          <w:tab w:val="num" w:pos="720"/>
+        </w:tabs>
+        <w:ind w:left="720" w:hanging="360"/>
+      </w:pPr>
+      <w:rPr>
+        <w:rFonts w:ascii="Symbol" w:hAnsi="Symbol" w:hint="default"/>
+        <w:sz w:val="20"/>
+      </w:rPr>
+    </w:lvl>
+    <w:lvl w:ilvl="1" w:tentative="1">
+      <w:start w:val="1"/>
+      <w:numFmt w:val="bullet"/>
+      <w:lvlText w:val="o"/>
+      <w:lvlJc w:val="left"/>
+      <w:pPr>
+        <w:tabs>
+          <w:tab w:val="num" w:pos="1440"/>
+        </w:tabs>
+        <w:ind w:left="1440" w:hanging="360"/>
+      </w:pPr>
+      <w:rPr>
+        <w:rFonts w:ascii="Courier New" w:hAnsi="Courier New" w:hint="default"/>
+        <w:sz w:val="20"/>
+      </w:rPr>
+    </w:lvl>
+    <w:lvl w:ilvl="2" w:tentative="1">
+      <w:start w:val="1"/>
+      <w:numFmt w:val="bullet"/>
+      <w:lvlText w:val=""/>
+      <w:lvlJc w:val="left"/>
+      <w:pPr>
+        <w:tabs>
+          <w:tab w:val="num" w:pos="2160"/>
+        </w:tabs>
+        <w:ind w:left="2160" w:hanging="360"/>
+      </w:pPr>
+      <w:rPr>
+        <w:rFonts w:ascii="Wingdings" w:hAnsi="Wingdings" w:hint="default"/>
+        <w:sz w:val="20"/>
+      </w:rPr>
+    </w:lvl>
+    <w:lvl w:ilvl="3" w:tentative="1">
+      <w:start w:val="1"/>
+      <w:numFmt w:val="bullet"/>
+      <w:lvlText w:val=""/>
+      <w:lvlJc w:val="left"/>
+      <w:pPr>
+        <w:tabs>
+          <w:tab w:val="num" w:pos="2880"/>
+        </w:tabs>
+        <w:ind w:left="2880" w:hanging="360"/>
+      </w:pPr>
+      <w:rPr>
+        <w:rFonts w:ascii="Wingdings" w:hAnsi="Wingdings" w:hint="default"/>
+        <w:sz w:val="20"/>
+      </w:rPr>
+    </w:lvl>
+    <w:lvl w:ilvl="4" w:tentative="1">
+      <w:start w:val="1"/>
+      <w:numFmt w:val="bullet"/>
+      <w:lvlText w:val=""/>
+      <w:lvlJc w:val="left"/>
+      <w:pPr>
+        <w:tabs>
+          <w:tab w:val="num" w:pos="3600"/>
+        </w:tabs>
+        <w:ind w:left="3600" w:hanging="360"/>
+      </w:pPr>
+      <w:rPr>
+        <w:rFonts w:ascii="Wingdings" w:hAnsi="Wingdings" w:hint="default"/>
+        <w:sz w:val="20"/>
+      </w:rPr>
+    </w:lvl>
+    <w:lvl w:ilvl="5" w:tentative="1">
+      <w:start w:val="1"/>
+      <w:numFmt w:val="bullet"/>
+      <w:lvlText w:val=""/>
+      <w:lvlJc w:val="left"/>
+      <w:pPr>
+        <w:tabs>
+          <w:tab w:val="num" w:pos="4320"/>
+        </w:tabs>
+        <w:ind w:left="4320" w:hanging="360"/>
+      </w:pPr>
+      <w:rPr>
+        <w:rFonts w:ascii="Wingdings" w:hAnsi="Wingdings" w:hint="default"/>
+        <w:sz w:val="20"/>
+      </w:rPr>
+    </w:lvl>
+    <w:lvl w:ilvl="6" w:tentative="1">
+      <w:start w:val="1"/>
+      <w:numFmt w:val="bullet"/>
+      <w:lvlText w:val=""/>
+      <w:lvlJc w:val="left"/>
+      <w:pPr>
+        <w:tabs>
+          <w:tab w:val="num" w:pos="5040"/>
+        </w:tabs>
+        <w:ind w:left="5040" w:hanging="360"/>
+      </w:pPr>
+      <w:rPr>
+        <w:rFonts w:ascii="Wingdings" w:hAnsi="Wingdings" w:hint="default"/>
+        <w:sz w:val="20"/>
+      </w:rPr>
+    </w:lvl>
+    <w:lvl w:ilvl="7" w:tentative="1">
+      <w:start w:val="1"/>
+      <w:numFmt w:val="bullet"/>
+      <w:lvlText w:val=""/>
+      <w:lvlJc w:val="left"/>
+      <w:pPr>
+        <w:tabs>
+          <w:tab w:val="num" w:pos="5760"/>
+        </w:tabs>
+        <w:ind w:left="5760" w:hanging="360"/>
+      </w:pPr>
+      <w:rPr>
+        <w:rFonts w:ascii="Wingdings" w:hAnsi="Wingdings" w:hint="default"/>
+        <w:sz w:val="20"/>
+      </w:rPr>
+    </w:lvl>
+    <w:lvl w:ilvl="8" w:tentative="1">
+      <w:start w:val="1"/>
+      <w:numFmt w:val="bullet"/>
+      <w:lvlText w:val=""/>
+      <w:lvlJc w:val="left"/>
+      <w:pPr>
+        <w:tabs>
+          <w:tab w:val="num" w:pos="6480"/>
+        </w:tabs>
+        <w:ind w:left="6480" w:hanging="360"/>
+      </w:pPr>
+      <w:rPr>
+        <w:rFonts w:ascii="Wingdings" w:hAnsi="Wingdings" w:hint="default"/>
+        <w:sz w:val="20"/>
+      </w:rPr>
+    </w:lvl>
+  </w:abstractNum>
+  <w:abstractNum w:abstractNumId="8" w15:restartNumberingAfterBreak="0">
     <w:nsid w:val="75231657"/>
     <w:multiLevelType w:val="hybridMultilevel"/>
     <w:tmpl w:val="DBB8D046"/>
@@ -2519,7 +5152,7 @@
       </w:rPr>
     </w:lvl>
   </w:abstractNum>
-  <w:abstractNum w:abstractNumId="5" w15:restartNumberingAfterBreak="0">
+  <w:abstractNum w:abstractNumId="9" w15:restartNumberingAfterBreak="0">
     <w:nsid w:val="7AC361DC"/>
     <w:multiLevelType w:val="hybridMultilevel"/>
     <w:tmpl w:val="17D22ADE"/>
@@ -2606,22 +5239,34 @@
     </w:lvl>
   </w:abstractNum>
   <w:num w:numId="1" w16cid:durableId="1615284772">
+    <w:abstractNumId w:val="2"/>
+  </w:num>
+  <w:num w:numId="2" w16cid:durableId="1261377763">
+    <w:abstractNumId w:val="8"/>
+  </w:num>
+  <w:num w:numId="3" w16cid:durableId="85079630">
+    <w:abstractNumId w:val="9"/>
+  </w:num>
+  <w:num w:numId="4" w16cid:durableId="583999270">
+    <w:abstractNumId w:val="3"/>
+  </w:num>
+  <w:num w:numId="5" w16cid:durableId="2133865065">
     <w:abstractNumId w:val="1"/>
   </w:num>
-  <w:num w:numId="2" w16cid:durableId="1261377763">
+  <w:num w:numId="6" w16cid:durableId="1200167151">
     <w:abstractNumId w:val="4"/>
   </w:num>
-  <w:num w:numId="3" w16cid:durableId="85079630">
+  <w:num w:numId="7" w16cid:durableId="450439969">
+    <w:abstractNumId w:val="7"/>
+  </w:num>
+  <w:num w:numId="8" w16cid:durableId="1176504121">
+    <w:abstractNumId w:val="6"/>
+  </w:num>
+  <w:num w:numId="9" w16cid:durableId="1000549173">
     <w:abstractNumId w:val="5"/>
   </w:num>
-  <w:num w:numId="4" w16cid:durableId="583999270">
-    <w:abstractNumId w:val="2"/>
-  </w:num>
-  <w:num w:numId="5" w16cid:durableId="2133865065">
+  <w:num w:numId="10" w16cid:durableId="2116439946">
     <w:abstractNumId w:val="0"/>
-  </w:num>
-  <w:num w:numId="6" w16cid:durableId="1200167151">
-    <w:abstractNumId w:val="3"/>
   </w:num>
 </w:numbering>
 </file>
@@ -3226,7 +5871,6 @@
   <w:style w:type="character" w:default="1" w:styleId="Fontepargpadro">
     <w:name w:val="Default Paragraph Font"/>
     <w:uiPriority w:val="1"/>
-    <w:semiHidden/>
     <w:unhideWhenUsed/>
   </w:style>
   <w:style w:type="table" w:default="1" w:styleId="Tabelanormal">

</xml_diff>